<commit_message>
Update portfolio CV asset
</commit_message>
<xml_diff>
--- a/img/Haruna_Hamidu_Kwairanga_CV.docx
+++ b/img/Haruna_Hamidu_Kwairanga_CV.docx
@@ -5,11 +5,9 @@
     <w:p>
       <w:pPr>
         <w:pStyle w:val="15"/>
-        <w:spacing w:after="20" w:line="240" w:lineRule="auto"/>
+        <w:spacing w:line="240" w:lineRule="auto" w:after="20"/>
         <w:jc w:val="center"/>
       </w:pPr>
-      <w:bookmarkStart w:id="0" w:name="_GoBack"/>
-      <w:bookmarkEnd w:id="0"/>
       <w:r>
         <w:rPr>
           <w:rFonts w:ascii="Aptos Display" w:hAnsi="Aptos Display"/>
@@ -38,86 +36,25 @@
       </w:pPr>
       <w:r>
         <w:rPr>
-          <w:sz w:val="18"/>
-        </w:rPr>
-        <w:fldChar w:fldCharType="begin"/>
-      </w:r>
-      <w:r>
-        <w:rPr>
-          <w:sz w:val="18"/>
-        </w:rPr>
-        <w:instrText xml:space="preserve"> HYPERLINK "https://www.linkedin.com/in/haruna-hameed-kwairanga-a83167247" \h </w:instrText>
-      </w:r>
-      <w:r>
-        <w:rPr>
-          <w:sz w:val="18"/>
-        </w:rPr>
-        <w:fldChar w:fldCharType="separate"/>
-      </w:r>
-      <w:r>
-        <w:rPr>
-          <w:color w:val="0563C1"/>
-          <w:sz w:val="18"/>
-          <w:u w:val="single"/>
-        </w:rPr>
-        <w:t>LinkedIn</w:t>
-      </w:r>
-      <w:r>
-        <w:rPr>
-          <w:color w:val="0563C1"/>
-          <w:sz w:val="18"/>
-          <w:u w:val="single"/>
-        </w:rPr>
-        <w:fldChar w:fldCharType="end"/>
-      </w:r>
-      <w:r>
-        <w:rPr>
-          <w:b w:val="0"/>
-          <w:i w:val="0"/>
-          <w:sz w:val="18"/>
-        </w:rPr>
-        <w:t xml:space="preserve">  |  </w:t>
-      </w:r>
-      <w:r>
-        <w:rPr>
-          <w:sz w:val="18"/>
-        </w:rPr>
-        <w:fldChar w:fldCharType="begin"/>
-      </w:r>
-      <w:r>
-        <w:rPr>
-          <w:sz w:val="18"/>
-        </w:rPr>
-        <w:instrText xml:space="preserve"> HYPERLINK "https://github.com/hhkwairanga" \h </w:instrText>
-      </w:r>
-      <w:r>
-        <w:rPr>
-          <w:sz w:val="18"/>
-        </w:rPr>
-        <w:fldChar w:fldCharType="separate"/>
-      </w:r>
-      <w:r>
-        <w:rPr>
-          <w:color w:val="0563C1"/>
-          <w:sz w:val="18"/>
-          <w:u w:val="single"/>
-        </w:rPr>
-        <w:t>GitHub</w:t>
-      </w:r>
-      <w:r>
-        <w:rPr>
-          <w:color w:val="0563C1"/>
-          <w:sz w:val="18"/>
-          <w:u w:val="single"/>
-        </w:rPr>
-        <w:fldChar w:fldCharType="end"/>
-      </w:r>
+          <w:b/>
+        </w:rPr>
+        <w:t xml:space="preserve">Portfolio: </w:t>
+      </w:r>
+      <w:hyperlink r:id="rId9">
+        <w:r>
+          <w:rPr>
+            <w:color w:val="0563C1"/>
+            <w:u w:val="single"/>
+          </w:rPr>
+          <w:t>hhkwairanga.github.io/haruna/</w:t>
+        </w:r>
+      </w:hyperlink>
     </w:p>
     <w:p>
       <w:pPr>
         <w:pStyle w:val="2"/>
         <w:keepNext/>
-        <w:spacing w:before="120" w:after="50" w:line="240" w:lineRule="auto"/>
+        <w:spacing w:line="240" w:lineRule="auto" w:before="120" w:after="50"/>
       </w:pPr>
       <w:r>
         <w:rPr>
@@ -130,11 +67,8 @@
     </w:p>
     <w:p>
       <w:pPr>
-        <w:spacing w:after="34" w:line="240" w:lineRule="auto"/>
+        <w:spacing w:line="240" w:lineRule="auto" w:after="34"/>
         <w:ind w:left="202" w:hanging="144"/>
-        <w:rPr>
-          <w:sz w:val="18"/>
-        </w:rPr>
       </w:pPr>
       <w:r>
         <w:rPr>
@@ -145,36 +79,33 @@
     </w:p>
     <w:p>
       <w:pPr>
-        <w:spacing w:after="34" w:line="240" w:lineRule="auto"/>
+        <w:spacing w:line="240" w:lineRule="auto" w:after="34"/>
         <w:ind w:left="202" w:hanging="144"/>
-        <w:rPr>
-          <w:sz w:val="18"/>
-        </w:rPr>
+      </w:pPr>
+      <w:r>
+        <w:rPr>
+          <w:sz w:val="18"/>
+        </w:rPr>
+        <w:t>• Intelligent Transportation, Automotive Diagnostics and Data-Driven Mobility</w:t>
+      </w:r>
+    </w:p>
+    <w:p>
+      <w:pPr>
+        <w:spacing w:line="240" w:lineRule="auto" w:after="34"/>
+        <w:ind w:left="202" w:hanging="144"/>
       </w:pPr>
       <w:r>
         <w:rPr>
           <w:sz w:val="18"/>
         </w:rPr>
         <w:t>• Data Analytics, Process Automation and Digital Public/Enterprise Systems</w:t>
-      </w:r>
-    </w:p>
-    <w:p>
-      <w:pPr>
-        <w:spacing w:after="34" w:line="240" w:lineRule="auto"/>
-        <w:ind w:left="202" w:hanging="144"/>
-      </w:pPr>
-      <w:r>
-        <w:rPr>
-          <w:sz w:val="18"/>
-        </w:rPr>
-        <w:t>• Intelligent Transportation, Automotive Diagnostics and Data-Driven Mobility</w:t>
       </w:r>
     </w:p>
     <w:p>
       <w:pPr>
         <w:pStyle w:val="2"/>
         <w:keepNext/>
-        <w:spacing w:before="120" w:after="50" w:line="240" w:lineRule="auto"/>
+        <w:spacing w:line="240" w:lineRule="auto" w:before="120" w:after="50"/>
       </w:pPr>
       <w:r>
         <w:rPr>
@@ -183,6 +114,426 @@
           <w:sz w:val="20"/>
         </w:rPr>
         <w:t>EDUCATION</w:t>
+      </w:r>
+    </w:p>
+    <w:tbl>
+      <w:tblPr>
+        <w:tblStyle w:val="6"/>
+        <w:tblW w:w="0" w:type="auto"/>
+        <w:jc w:val="center"/>
+        <w:tblBorders>
+          <w:top w:val="none" w:color="auto" w:sz="0" w:space="0"/>
+          <w:left w:val="none" w:color="auto" w:sz="0" w:space="0"/>
+          <w:bottom w:val="none" w:color="auto" w:sz="0" w:space="0"/>
+          <w:right w:val="none" w:color="auto" w:sz="0" w:space="0"/>
+          <w:insideH w:val="none" w:color="auto" w:sz="0" w:space="0"/>
+          <w:insideV w:val="none" w:color="auto" w:sz="0" w:space="0"/>
+        </w:tblBorders>
+        <w:tblLayout w:type="fixed"/>
+        <w:tblCellMar>
+          <w:top w:w="0" w:type="dxa"/>
+          <w:left w:w="108" w:type="dxa"/>
+          <w:bottom w:w="0" w:type="dxa"/>
+          <w:right w:w="108" w:type="dxa"/>
+        </w:tblCellMar>
+      </w:tblPr>
+      <w:tblGrid>
+        <w:gridCol w:w="8568"/>
+        <w:gridCol w:w="1656"/>
+      </w:tblGrid>
+      <w:tr>
+        <w:trPr>
+          <w:jc w:val="center"/>
+        </w:trPr>
+        <w:tc>
+          <w:tcPr>
+            <w:tcW w:w="9000" w:type="dxa"/>
+            <w:vAlign w:val="center"/>
+            <w:tcMar>
+              <w:top w:w="20" w:type="dxa"/>
+              <w:start w:w="0" w:type="dxa"/>
+              <w:bottom w:w="20" w:type="dxa"/>
+              <w:end w:w="40" w:type="dxa"/>
+            </w:tcMar>
+          </w:tcPr>
+          <w:p>
+            <w:pPr>
+              <w:keepNext/>
+              <w:spacing w:after="0" w:before="0" w:line="240" w:lineRule="auto"/>
+            </w:pPr>
+            <w:r>
+              <w:rPr>
+                <w:rFonts w:ascii="Aptos" w:hAnsi="Aptos"/>
+                <w:b/>
+                <w:sz w:val="18"/>
+              </w:rPr>
+              <w:t>Bachelor of Technology (B.Tech), Automobile Technology Education</w:t>
+            </w:r>
+          </w:p>
+        </w:tc>
+        <w:tc>
+          <w:tcPr>
+            <w:tcW w:w="1512" w:type="dxa"/>
+            <w:vAlign w:val="center"/>
+            <w:tcMar>
+              <w:top w:w="20" w:type="dxa"/>
+              <w:start w:w="20" w:type="dxa"/>
+              <w:bottom w:w="20" w:type="dxa"/>
+              <w:end w:w="0" w:type="dxa"/>
+            </w:tcMar>
+          </w:tcPr>
+          <w:p>
+            <w:pPr>
+              <w:keepNext/>
+              <w:spacing w:after="0" w:before="0" w:line="240" w:lineRule="auto"/>
+              <w:jc w:val="right"/>
+            </w:pPr>
+            <w:r>
+              <w:rPr>
+                <w:rFonts w:ascii="Aptos" w:hAnsi="Aptos"/>
+                <w:b/>
+                <w:sz w:val="18"/>
+              </w:rPr>
+              <w:t>2023</w:t>
+            </w:r>
+          </w:p>
+        </w:tc>
+      </w:tr>
+    </w:tbl>
+    <w:p>
+      <w:pPr>
+        <w:spacing w:after="24" w:line="240" w:lineRule="auto"/>
+      </w:pPr>
+      <w:r>
+        <w:rPr>
+          <w:i/>
+          <w:sz w:val="18"/>
+        </w:rPr>
+        <w:t>Abubakar Tafawa Balewa University (ATBU), Bauchi, Nigeria | First Class Honours, CGPA 4.69/5.00</w:t>
+      </w:r>
+    </w:p>
+    <w:p>
+      <w:pPr>
+        <w:spacing w:after="28" w:line="240" w:lineRule="auto"/>
+      </w:pPr>
+      <w:r>
+        <w:rPr>
+          <w:b/>
+          <w:sz w:val="18"/>
+        </w:rPr>
+        <w:t xml:space="preserve">Final-Year Research: </w:t>
+      </w:r>
+      <w:r>
+        <w:rPr>
+          <w:sz w:val="18"/>
+        </w:rPr>
+        <w:t>Technical Skills Required of Auto-Mechanic Students for Using OBD-II Scan Tools in North-Eastern Nigeria</w:t>
+      </w:r>
+    </w:p>
+    <w:p>
+      <w:pPr>
+        <w:spacing w:after="24" w:line="240" w:lineRule="auto"/>
+      </w:pPr>
+      <w:r>
+        <w:rPr>
+          <w:b/>
+          <w:sz w:val="18"/>
+        </w:rPr>
+        <w:t xml:space="preserve">Supervisor: </w:t>
+      </w:r>
+      <w:r>
+        <w:rPr>
+          <w:sz w:val="18"/>
+        </w:rPr>
+        <w:t>Prof. I. Y. Shehu</w:t>
+      </w:r>
+    </w:p>
+    <w:p>
+      <w:pPr>
+        <w:pStyle w:val="2"/>
+        <w:keepNext/>
+        <w:spacing w:line="240" w:lineRule="auto" w:before="120" w:after="50"/>
+      </w:pPr>
+      <w:r>
+        <w:rPr>
+          <w:rFonts w:ascii="Aptos" w:hAnsi="Aptos"/>
+          <w:b/>
+          <w:sz w:val="20"/>
+        </w:rPr>
+        <w:t>RESEARCH &amp; ACADEMIC PROJECT EXPERIENCE</w:t>
+      </w:r>
+    </w:p>
+    <w:tbl>
+      <w:tblPr>
+        <w:tblStyle w:val="6"/>
+        <w:tblW w:w="0" w:type="auto"/>
+        <w:jc w:val="center"/>
+        <w:tblBorders>
+          <w:top w:val="none" w:color="auto" w:sz="0" w:space="0"/>
+          <w:left w:val="none" w:color="auto" w:sz="0" w:space="0"/>
+          <w:bottom w:val="none" w:color="auto" w:sz="0" w:space="0"/>
+          <w:right w:val="none" w:color="auto" w:sz="0" w:space="0"/>
+          <w:insideH w:val="none" w:color="auto" w:sz="0" w:space="0"/>
+          <w:insideV w:val="none" w:color="auto" w:sz="0" w:space="0"/>
+        </w:tblBorders>
+        <w:tblLayout w:type="fixed"/>
+        <w:tblCellMar>
+          <w:top w:w="0" w:type="dxa"/>
+          <w:left w:w="108" w:type="dxa"/>
+          <w:bottom w:w="0" w:type="dxa"/>
+          <w:right w:w="108" w:type="dxa"/>
+        </w:tblCellMar>
+      </w:tblPr>
+      <w:tblGrid>
+        <w:gridCol w:w="8568"/>
+        <w:gridCol w:w="1656"/>
+      </w:tblGrid>
+      <w:tr>
+        <w:trPr>
+          <w:jc w:val="center"/>
+        </w:trPr>
+        <w:tc>
+          <w:tcPr>
+            <w:tcW w:w="9000" w:type="dxa"/>
+            <w:vAlign w:val="center"/>
+            <w:tcMar>
+              <w:top w:w="20" w:type="dxa"/>
+              <w:start w:w="0" w:type="dxa"/>
+              <w:bottom w:w="20" w:type="dxa"/>
+              <w:end w:w="40" w:type="dxa"/>
+            </w:tcMar>
+          </w:tcPr>
+          <w:p>
+            <w:pPr>
+              <w:keepNext/>
+              <w:spacing w:after="0" w:before="0" w:line="240" w:lineRule="auto"/>
+            </w:pPr>
+            <w:r>
+              <w:rPr>
+                <w:rFonts w:ascii="Aptos" w:hAnsi="Aptos"/>
+                <w:b/>
+                <w:sz w:val="18"/>
+              </w:rPr>
+              <w:t>Undergraduate Research Project – OBD-II Skills and Automotive Diagnostics</w:t>
+            </w:r>
+          </w:p>
+        </w:tc>
+        <w:tc>
+          <w:tcPr>
+            <w:tcW w:w="1512" w:type="dxa"/>
+            <w:vAlign w:val="center"/>
+            <w:tcMar>
+              <w:top w:w="20" w:type="dxa"/>
+              <w:start w:w="20" w:type="dxa"/>
+              <w:bottom w:w="20" w:type="dxa"/>
+              <w:end w:w="0" w:type="dxa"/>
+            </w:tcMar>
+          </w:tcPr>
+          <w:p>
+            <w:pPr>
+              <w:keepNext/>
+              <w:spacing w:after="0" w:before="0" w:line="240" w:lineRule="auto"/>
+              <w:jc w:val="right"/>
+            </w:pPr>
+          </w:p>
+        </w:tc>
+      </w:tr>
+    </w:tbl>
+    <w:p>
+      <w:pPr>
+        <w:spacing w:after="28" w:line="240" w:lineRule="auto"/>
+      </w:pPr>
+      <w:r>
+        <w:rPr>
+          <w:i/>
+          <w:sz w:val="18"/>
+        </w:rPr>
+        <w:t>Abubakar Tafawa Balewa University, Bauchi, Nigeria</w:t>
+      </w:r>
+    </w:p>
+    <w:p>
+      <w:pPr>
+        <w:spacing w:after="24" w:line="240" w:lineRule="auto"/>
+      </w:pPr>
+      <w:r>
+        <w:rPr>
+          <w:b/>
+          <w:sz w:val="18"/>
+        </w:rPr>
+        <w:t xml:space="preserve">Advisor/Supervisor: </w:t>
+      </w:r>
+      <w:r>
+        <w:rPr>
+          <w:sz w:val="18"/>
+        </w:rPr>
+        <w:t>Prof. I. Y. Shehu</w:t>
+      </w:r>
+    </w:p>
+    <w:p>
+      <w:pPr>
+        <w:spacing w:line="240" w:lineRule="auto" w:after="34"/>
+        <w:ind w:left="202" w:hanging="144"/>
+      </w:pPr>
+      <w:r>
+        <w:rPr>
+          <w:sz w:val="18"/>
+        </w:rPr>
+        <w:t>• Conducted surveys and interviews with auto-mechanic students and instructors to assess competence with OBD-II diagnostic tools.</w:t>
+      </w:r>
+    </w:p>
+    <w:p>
+      <w:pPr>
+        <w:spacing w:line="240" w:lineRule="auto" w:after="34"/>
+        <w:ind w:left="202" w:hanging="144"/>
+      </w:pPr>
+      <w:r>
+        <w:rPr>
+          <w:sz w:val="18"/>
+        </w:rPr>
+        <w:t>• Identified gaps in digital and technical skills required for modern vehicle diagnostics and recommended curriculum updates and hands-on training.</w:t>
+      </w:r>
+    </w:p>
+    <w:p>
+      <w:pPr>
+        <w:spacing w:line="240" w:lineRule="auto" w:after="34"/>
+        <w:ind w:left="202" w:hanging="144"/>
+      </w:pPr>
+      <w:r>
+        <w:rPr>
+          <w:sz w:val="18"/>
+        </w:rPr>
+        <w:t>• Applied quantitative and qualitative research methods to connect automotive technology education with emerging digital diagnostic practice.</w:t>
+      </w:r>
+    </w:p>
+    <w:tbl>
+      <w:tblPr>
+        <w:tblStyle w:val="6"/>
+        <w:tblW w:w="0" w:type="auto"/>
+        <w:jc w:val="center"/>
+        <w:tblBorders>
+          <w:top w:val="none" w:color="auto" w:sz="0" w:space="0"/>
+          <w:left w:val="none" w:color="auto" w:sz="0" w:space="0"/>
+          <w:bottom w:val="none" w:color="auto" w:sz="0" w:space="0"/>
+          <w:right w:val="none" w:color="auto" w:sz="0" w:space="0"/>
+          <w:insideH w:val="none" w:color="auto" w:sz="0" w:space="0"/>
+          <w:insideV w:val="none" w:color="auto" w:sz="0" w:space="0"/>
+        </w:tblBorders>
+        <w:tblLayout w:type="fixed"/>
+        <w:tblCellMar>
+          <w:top w:w="0" w:type="dxa"/>
+          <w:left w:w="108" w:type="dxa"/>
+          <w:bottom w:w="0" w:type="dxa"/>
+          <w:right w:w="108" w:type="dxa"/>
+        </w:tblCellMar>
+      </w:tblPr>
+      <w:tblGrid>
+        <w:gridCol w:w="8568"/>
+        <w:gridCol w:w="1656"/>
+      </w:tblGrid>
+      <w:tr>
+        <w:trPr>
+          <w:jc w:val="center"/>
+        </w:trPr>
+        <w:tc>
+          <w:tcPr>
+            <w:tcW w:w="9000" w:type="dxa"/>
+            <w:vAlign w:val="center"/>
+            <w:tcMar>
+              <w:top w:w="20" w:type="dxa"/>
+              <w:start w:w="0" w:type="dxa"/>
+              <w:bottom w:w="20" w:type="dxa"/>
+              <w:end w:w="40" w:type="dxa"/>
+            </w:tcMar>
+          </w:tcPr>
+          <w:p>
+            <w:pPr>
+              <w:keepNext/>
+              <w:spacing w:after="0" w:before="0" w:line="240" w:lineRule="auto"/>
+            </w:pPr>
+            <w:r>
+              <w:rPr>
+                <w:rFonts w:ascii="Aptos" w:hAnsi="Aptos"/>
+                <w:b/>
+                <w:sz w:val="18"/>
+              </w:rPr>
+              <w:t>Engineering Project – Conversion of Petrol Engines to Liquefied Petroleum Gas (LPG)</w:t>
+            </w:r>
+          </w:p>
+        </w:tc>
+        <w:tc>
+          <w:tcPr>
+            <w:tcW w:w="1512" w:type="dxa"/>
+            <w:vAlign w:val="center"/>
+            <w:tcMar>
+              <w:top w:w="20" w:type="dxa"/>
+              <w:start w:w="20" w:type="dxa"/>
+              <w:bottom w:w="20" w:type="dxa"/>
+              <w:end w:w="0" w:type="dxa"/>
+            </w:tcMar>
+          </w:tcPr>
+          <w:p>
+            <w:pPr>
+              <w:keepNext/>
+              <w:spacing w:after="0" w:before="0" w:line="240" w:lineRule="auto"/>
+              <w:jc w:val="right"/>
+              <w:rPr>
+                <w:rFonts w:hint="default"/>
+                <w:lang w:val="en-US"/>
+              </w:rPr>
+            </w:pPr>
+          </w:p>
+        </w:tc>
+      </w:tr>
+    </w:tbl>
+    <w:p>
+      <w:pPr>
+        <w:spacing w:after="28" w:line="240" w:lineRule="auto"/>
+      </w:pPr>
+      <w:r>
+        <w:rPr>
+          <w:i/>
+          <w:sz w:val="18"/>
+        </w:rPr>
+        <w:t>Automotive Mechatronics Workshop, ATBU, Bauchi</w:t>
+      </w:r>
+    </w:p>
+    <w:p>
+      <w:pPr>
+        <w:spacing w:line="240" w:lineRule="auto" w:after="34"/>
+        <w:ind w:left="202" w:hanging="144"/>
+      </w:pPr>
+      <w:r>
+        <w:rPr>
+          <w:sz w:val="18"/>
+        </w:rPr>
+        <w:t>• Analysed engineering design and safety requirements for LPG conversion kits and converted small petrol engines to dual-fuel operation.</w:t>
+      </w:r>
+    </w:p>
+    <w:p>
+      <w:pPr>
+        <w:spacing w:line="240" w:lineRule="auto" w:after="34"/>
+        <w:ind w:left="202" w:hanging="144"/>
+      </w:pPr>
+      <w:r>
+        <w:rPr>
+          <w:sz w:val="18"/>
+        </w:rPr>
+        <w:t>• Evaluated fuel efficiency, emissions and operating-cost implications relative to petrol, with emphasis on cleaner and lower-cost mobility.</w:t>
+      </w:r>
+    </w:p>
+    <w:p>
+      <w:pPr>
+        <w:pStyle w:val="2"/>
+        <w:keepNext/>
+        <w:spacing w:line="240" w:lineRule="auto" w:before="120" w:after="50"/>
+      </w:pPr>
+      <w:r>
+        <w:rPr>
+          <w:rFonts w:ascii="Aptos" w:hAnsi="Aptos"/>
+          <w:b/>
+          <w:sz w:val="20"/>
+        </w:rPr>
+        <w:t>PROFESSIONAL, RESEARCH &amp; PRODUCT DEVELOPMENT EXPERIENCE</w:t>
       </w:r>
     </w:p>
     <w:tbl>
@@ -221,14 +572,16 @@
               <w:top w:w="20" w:type="dxa"/>
               <w:left w:w="0" w:type="dxa"/>
               <w:bottom w:w="20" w:type="dxa"/>
-              <w:right w:w="40" w:type="dxa"/>
+              <w:right w:w="0" w:type="dxa"/>
+              <w:start w:w="0" w:type="dxa"/>
+              <w:end w:w="40" w:type="dxa"/>
             </w:tcMar>
             <w:vAlign w:val="center"/>
           </w:tcPr>
           <w:p>
             <w:pPr>
               <w:keepNext/>
-              <w:spacing w:before="0" w:after="0" w:line="240" w:lineRule="auto"/>
+              <w:spacing w:after="0" w:before="0" w:line="240" w:lineRule="auto"/>
             </w:pPr>
             <w:r>
               <w:rPr>
@@ -236,7 +589,7 @@
                 <w:b/>
                 <w:sz w:val="18"/>
               </w:rPr>
-              <w:t>Bachelor of Technology (B.Tech), Automobile Technology Education</w:t>
+              <w:t>Founder – Sahab Technology Integrated Limited</w:t>
             </w:r>
           </w:p>
         </w:tc>
@@ -245,16 +598,18 @@
             <w:tcW w:w="1512" w:type="dxa"/>
             <w:tcMar>
               <w:top w:w="20" w:type="dxa"/>
-              <w:left w:w="20" w:type="dxa"/>
+              <w:left w:w="0" w:type="dxa"/>
               <w:bottom w:w="20" w:type="dxa"/>
               <w:right w:w="0" w:type="dxa"/>
+              <w:start w:w="20" w:type="dxa"/>
+              <w:end w:w="0" w:type="dxa"/>
             </w:tcMar>
             <w:vAlign w:val="center"/>
           </w:tcPr>
           <w:p>
             <w:pPr>
               <w:keepNext/>
-              <w:spacing w:before="0" w:after="0" w:line="240" w:lineRule="auto"/>
+              <w:spacing w:after="0" w:before="0" w:line="240" w:lineRule="auto"/>
               <w:jc w:val="right"/>
             </w:pPr>
             <w:r>
@@ -263,7 +618,7 @@
                 <w:b/>
                 <w:sz w:val="18"/>
               </w:rPr>
-              <w:t>2023</w:t>
+              <w:t>2025–Present</w:t>
             </w:r>
           </w:p>
         </w:tc>
@@ -271,65 +626,133 @@
     </w:tbl>
     <w:p>
       <w:pPr>
-        <w:spacing w:after="24" w:line="240" w:lineRule="auto"/>
-      </w:pPr>
-      <w:r>
-        <w:rPr>
+        <w:keepNext/>
+        <w:spacing w:before="0" w:after="24" w:line="240" w:lineRule="auto"/>
+      </w:pPr>
+      <w:r>
+        <w:rPr>
+          <w:b w:val="0"/>
           <w:i/>
           <w:sz w:val="18"/>
         </w:rPr>
-        <w:t>Abubakar Tafawa Balewa University (ATBU), Bauchi, Nigeria | First Class Honours, CGPA 4.69/5.00</w:t>
-      </w:r>
-    </w:p>
-    <w:p>
-      <w:pPr>
-        <w:spacing w:after="28" w:line="240" w:lineRule="auto"/>
+        <w:t>Technology entrepreneurship, software automation and digital systems</w:t>
+      </w:r>
+      <w:r>
+        <w:rPr>
+          <w:b w:val="0"/>
+          <w:i w:val="0"/>
+          <w:sz w:val="18"/>
+        </w:rPr>
+      </w:r>
+      <w:r>
+        <w:rPr>
+          <w:sz w:val="18"/>
+        </w:rPr>
+      </w:r>
+      <w:r>
+        <w:rPr>
+          <w:sz w:val="18"/>
+        </w:rPr>
+      </w:r>
+      <w:r>
+        <w:rPr>
+          <w:sz w:val="18"/>
+        </w:rPr>
+      </w:r>
+      <w:r>
+        <w:rPr>
+          <w:color w:val="0563C1"/>
+          <w:sz w:val="18"/>
+          <w:u w:val="single"/>
+        </w:rPr>
+      </w:r>
+      <w:r>
+        <w:rPr>
+          <w:color w:val="0563C1"/>
+          <w:sz w:val="18"/>
+          <w:u w:val="single"/>
+        </w:rPr>
+      </w:r>
+    </w:p>
+    <w:p>
+      <w:pPr>
+        <w:spacing w:before="0" w:after="24" w:line="240" w:lineRule="auto"/>
+        <w:ind w:left="202" w:hanging="144"/>
       </w:pPr>
       <w:r>
         <w:rPr>
           <w:b/>
-          <w:sz w:val="18"/>
-        </w:rPr>
-        <w:t xml:space="preserve">Final-Year Research: </w:t>
-      </w:r>
-      <w:r>
-        <w:rPr>
-          <w:sz w:val="18"/>
-        </w:rPr>
-        <w:t>Technical Skills Required of Auto-Mechanic Students for Using OBD-II Scan Tools in North-Eastern Nigeria</w:t>
-      </w:r>
-    </w:p>
-    <w:p>
-      <w:pPr>
-        <w:spacing w:after="24" w:line="240" w:lineRule="auto"/>
-      </w:pPr>
-      <w:r>
-        <w:rPr>
-          <w:b/>
-          <w:sz w:val="18"/>
-        </w:rPr>
-        <w:t xml:space="preserve">Supervisor: </w:t>
-      </w:r>
-      <w:r>
-        <w:rPr>
-          <w:sz w:val="18"/>
-        </w:rPr>
-        <w:t>Prof. I. Y. Shehu</w:t>
-      </w:r>
-    </w:p>
-    <w:p>
-      <w:pPr>
-        <w:pStyle w:val="2"/>
-        <w:keepNext/>
-        <w:spacing w:before="120" w:after="50" w:line="240" w:lineRule="auto"/>
-      </w:pPr>
-      <w:r>
-        <w:rPr>
-          <w:rFonts w:ascii="Aptos" w:hAnsi="Aptos"/>
-          <w:b/>
-          <w:sz w:val="20"/>
-        </w:rPr>
-        <w:t>RESEARCH &amp; ACADEMIC PROJECT EXPERIENCE</w:t>
+          <w:i w:val="0"/>
+          <w:sz w:val="18"/>
+        </w:rPr>
+        <w:t>• Product: NYSC Clearance, a SaaS platform for corps-member onboarding, attendance, leave, queries and monthly performance clearance.</w:t>
+      </w:r>
+      <w:r>
+        <w:rPr>
+          <w:b w:val="0"/>
+          <w:i w:val="0"/>
+          <w:sz w:val="18"/>
+        </w:rPr>
+      </w:r>
+      <w:r>
+        <w:rPr>
+          <w:sz w:val="18"/>
+        </w:rPr>
+      </w:r>
+      <w:r>
+        <w:rPr>
+          <w:sz w:val="18"/>
+        </w:rPr>
+      </w:r>
+      <w:r>
+        <w:rPr>
+          <w:sz w:val="18"/>
+        </w:rPr>
+      </w:r>
+      <w:r>
+        <w:rPr>
+          <w:color w:val="0563C1"/>
+          <w:sz w:val="18"/>
+          <w:u w:val="single"/>
+        </w:rPr>
+      </w:r>
+      <w:r>
+        <w:rPr>
+          <w:color w:val="0563C1"/>
+          <w:sz w:val="18"/>
+          <w:u w:val="single"/>
+        </w:rPr>
+      </w:r>
+      <w:r>
+        <w:rPr>
+          <w:b w:val="0"/>
+          <w:i w:val="0"/>
+          <w:sz w:val="18"/>
+        </w:rPr>
+      </w:r>
+    </w:p>
+    <w:p>
+      <w:pPr>
+        <w:spacing w:before="0" w:after="34" w:line="240" w:lineRule="auto"/>
+        <w:ind w:left="202" w:hanging="144"/>
+      </w:pPr>
+      <w:r>
+        <w:rPr>
+          <w:sz w:val="18"/>
+        </w:rPr>
+        <w:t>• Implemented face recognition, geofenced clock-in, QR-verified clearance letters, reporting, subscription/wallet features and organisation-specific deployment.</w:t>
+      </w:r>
+    </w:p>
+    <w:p>
+      <w:pPr>
+        <w:spacing w:before="0" w:after="34" w:line="240" w:lineRule="auto"/>
+        <w:ind w:left="202" w:hanging="144"/>
+      </w:pPr>
+      <w:r>
+        <w:rPr>
+          <w:sz w:val="18"/>
+        </w:rPr>
+        <w:t>• Built the platform with Django REST Framework, React/Vite, PostgreSQL, Paystack, Google Maps and Linux/Nginx deployment.</w:t>
       </w:r>
     </w:p>
     <w:tbl>
@@ -368,14 +791,16 @@
               <w:top w:w="20" w:type="dxa"/>
               <w:left w:w="0" w:type="dxa"/>
               <w:bottom w:w="20" w:type="dxa"/>
-              <w:right w:w="40" w:type="dxa"/>
+              <w:right w:w="0" w:type="dxa"/>
+              <w:start w:w="0" w:type="dxa"/>
+              <w:end w:w="40" w:type="dxa"/>
             </w:tcMar>
             <w:vAlign w:val="center"/>
           </w:tcPr>
           <w:p>
             <w:pPr>
               <w:keepNext/>
-              <w:spacing w:before="0" w:after="0" w:line="240" w:lineRule="auto"/>
+              <w:spacing w:after="0" w:before="0" w:line="240" w:lineRule="auto"/>
             </w:pPr>
             <w:r>
               <w:rPr>
@@ -383,7 +808,7 @@
                 <w:b/>
                 <w:sz w:val="18"/>
               </w:rPr>
-              <w:t>Undergraduate Research Project – OBD-II Skills and Automotive Diagnostics</w:t>
+              <w:t>National Youth Service Corps (NYSC) – Information Technology Department, NDIC</w:t>
             </w:r>
           </w:p>
         </w:tc>
@@ -392,86 +817,124 @@
             <w:tcW w:w="1512" w:type="dxa"/>
             <w:tcMar>
               <w:top w:w="20" w:type="dxa"/>
-              <w:left w:w="20" w:type="dxa"/>
+              <w:left w:w="0" w:type="dxa"/>
               <w:bottom w:w="20" w:type="dxa"/>
               <w:right w:w="0" w:type="dxa"/>
+              <w:start w:w="20" w:type="dxa"/>
+              <w:end w:w="0" w:type="dxa"/>
             </w:tcMar>
             <w:vAlign w:val="center"/>
           </w:tcPr>
           <w:p>
             <w:pPr>
               <w:keepNext/>
-              <w:spacing w:before="0" w:after="0" w:line="240" w:lineRule="auto"/>
+              <w:spacing w:after="0" w:before="0" w:line="240" w:lineRule="auto"/>
               <w:jc w:val="right"/>
+              <w:rPr>
+                <w:rFonts w:hint="default"/>
+                <w:b/>
+                <w:bCs/>
+                <w:lang w:val="en-US"/>
+              </w:rPr>
             </w:pPr>
+            <w:r>
+              <w:rPr>
+                <w:rFonts w:hint="default" w:ascii="Aptos" w:hAnsi="Aptos"/>
+                <w:b/>
+                <w:bCs/>
+                <w:sz w:val="18"/>
+                <w:lang w:val="en-US"/>
+              </w:rPr>
+              <w:t>2023–2024</w:t>
+            </w:r>
           </w:p>
         </w:tc>
       </w:tr>
     </w:tbl>
     <w:p>
       <w:pPr>
-        <w:spacing w:after="28" w:line="240" w:lineRule="auto"/>
-      </w:pPr>
-      <w:r>
-        <w:rPr>
+        <w:keepNext/>
+        <w:spacing w:before="0" w:after="24" w:line="240" w:lineRule="auto"/>
+      </w:pPr>
+      <w:r>
+        <w:rPr>
+          <w:b w:val="0"/>
           <w:i/>
           <w:sz w:val="18"/>
         </w:rPr>
-        <w:t>Abubakar Tafawa Balewa University, Bauchi, Nigeria</w:t>
-      </w:r>
-    </w:p>
-    <w:p>
-      <w:pPr>
-        <w:spacing w:after="24" w:line="240" w:lineRule="auto"/>
-      </w:pPr>
-      <w:r>
-        <w:rPr>
-          <w:b/>
-          <w:sz w:val="18"/>
-        </w:rPr>
-        <w:t xml:space="preserve">Advisor/Supervisor: </w:t>
-      </w:r>
-      <w:r>
-        <w:rPr>
-          <w:sz w:val="18"/>
-        </w:rPr>
-        <w:t>Prof. I. Y. Shehu</w:t>
-      </w:r>
-    </w:p>
-    <w:p>
-      <w:pPr>
-        <w:spacing w:after="34" w:line="240" w:lineRule="auto"/>
+        <w:t>Nigeria Deposit Insurance Corporation (NDIC)</w:t>
+      </w:r>
+      <w:r>
+        <w:rPr>
+          <w:b w:val="0"/>
+          <w:i w:val="0"/>
+          <w:sz w:val="18"/>
+        </w:rPr>
+      </w:r>
+      <w:r>
+        <w:rPr>
+          <w:sz w:val="18"/>
+        </w:rPr>
+      </w:r>
+      <w:r>
+        <w:rPr>
+          <w:sz w:val="18"/>
+        </w:rPr>
+      </w:r>
+      <w:r>
+        <w:rPr>
+          <w:sz w:val="18"/>
+        </w:rPr>
+      </w:r>
+      <w:r>
+        <w:rPr>
+          <w:color w:val="0563C1"/>
+          <w:sz w:val="18"/>
+          <w:u w:val="single"/>
+        </w:rPr>
+      </w:r>
+      <w:r>
+        <w:rPr>
+          <w:color w:val="0563C1"/>
+          <w:sz w:val="18"/>
+          <w:u w:val="single"/>
+        </w:rPr>
+      </w:r>
+    </w:p>
+    <w:p>
+      <w:pPr>
+        <w:spacing w:before="0" w:after="34" w:line="240" w:lineRule="auto"/>
         <w:ind w:left="202" w:hanging="144"/>
       </w:pPr>
       <w:r>
         <w:rPr>
           <w:sz w:val="18"/>
         </w:rPr>
-        <w:t>• Conducted surveys and interviews with auto-mechanic students and instructors to assess competence with OBD-II diagnostic tools.</w:t>
-      </w:r>
-    </w:p>
-    <w:p>
-      <w:pPr>
-        <w:spacing w:after="34" w:line="240" w:lineRule="auto"/>
+        <w:t>• Served in the Information Technology Department, supporting day-to-day IT operations and contributing to digital process improvement during the NYSC service year.</w:t>
+      </w:r>
+    </w:p>
+    <w:p>
+      <w:pPr>
+        <w:spacing w:before="0" w:after="34" w:line="240" w:lineRule="auto"/>
         <w:ind w:left="202" w:hanging="144"/>
       </w:pPr>
       <w:r>
         <w:rPr>
           <w:sz w:val="18"/>
         </w:rPr>
-        <w:t>• Identified gaps in digital and technical skills required for modern vehicle diagnostics and recommended curriculum updates and hands-on training.</w:t>
-      </w:r>
-    </w:p>
-    <w:p>
-      <w:pPr>
-        <w:spacing w:after="34" w:line="240" w:lineRule="auto"/>
+        <w:t>• Developed a face-recognition attendance module using Python and web technologies for real-time biometric attendance logging.</w:t>
+      </w:r>
+    </w:p>
+    <w:p>
+      <w:pPr>
+        <w:spacing w:before="0" w:after="34" w:line="240" w:lineRule="auto"/>
         <w:ind w:left="202" w:hanging="144"/>
       </w:pPr>
       <w:r>
         <w:rPr>
           <w:sz w:val="18"/>
         </w:rPr>
-        <w:t>• Applied quantitative and qualitative research methods to connect automotive technology education with emerging digital diagnostic practice.</w:t>
+        <w:t>• Designed backend workflows for attendance analysis, leave/query processing and automated clearance-letter generation, improving efficiency, traceability and transparency for corps members and interns.</w:t>
       </w:r>
     </w:p>
     <w:tbl>
@@ -510,14 +973,16 @@
               <w:top w:w="20" w:type="dxa"/>
               <w:left w:w="0" w:type="dxa"/>
               <w:bottom w:w="20" w:type="dxa"/>
-              <w:right w:w="40" w:type="dxa"/>
+              <w:right w:w="0" w:type="dxa"/>
+              <w:start w:w="0" w:type="dxa"/>
+              <w:end w:w="40" w:type="dxa"/>
             </w:tcMar>
             <w:vAlign w:val="center"/>
           </w:tcPr>
           <w:p>
             <w:pPr>
               <w:keepNext/>
-              <w:spacing w:before="0" w:after="0" w:line="240" w:lineRule="auto"/>
+              <w:spacing w:after="0" w:before="0" w:line="240" w:lineRule="auto"/>
             </w:pPr>
             <w:r>
               <w:rPr>
@@ -525,7 +990,7 @@
                 <w:b/>
                 <w:sz w:val="18"/>
               </w:rPr>
-              <w:t>Engineering Project – Conversion of Petrol Engines to Liquefied Petroleum Gas (LPG)</w:t>
+              <w:t>Data Automation Project – Tax Data Scraper</w:t>
             </w:r>
           </w:p>
         </w:tc>
@@ -534,75 +999,73 @@
             <w:tcW w:w="1512" w:type="dxa"/>
             <w:tcMar>
               <w:top w:w="20" w:type="dxa"/>
-              <w:left w:w="20" w:type="dxa"/>
+              <w:left w:w="0" w:type="dxa"/>
               <w:bottom w:w="20" w:type="dxa"/>
               <w:right w:w="0" w:type="dxa"/>
+              <w:start w:w="20" w:type="dxa"/>
+              <w:end w:w="0" w:type="dxa"/>
             </w:tcMar>
             <w:vAlign w:val="center"/>
           </w:tcPr>
           <w:p>
             <w:pPr>
               <w:keepNext/>
-              <w:spacing w:before="0" w:after="0" w:line="240" w:lineRule="auto"/>
+              <w:spacing w:after="0" w:before="0" w:line="240" w:lineRule="auto"/>
               <w:jc w:val="right"/>
               <w:rPr>
                 <w:rFonts w:hint="default"/>
                 <w:lang w:val="en-US"/>
               </w:rPr>
             </w:pPr>
+            <w:r>
+              <w:rPr>
+                <w:rFonts w:hint="default" w:ascii="Aptos" w:hAnsi="Aptos"/>
+                <w:b/>
+                <w:bCs/>
+                <w:sz w:val="18"/>
+                <w:lang w:val="en-US"/>
+              </w:rPr>
+              <w:t>2023</w:t>
+            </w:r>
           </w:p>
         </w:tc>
       </w:tr>
     </w:tbl>
     <w:p>
       <w:pPr>
-        <w:spacing w:after="28" w:line="240" w:lineRule="auto"/>
+        <w:keepNext/>
+        <w:spacing w:before="0" w:after="24" w:line="240" w:lineRule="auto"/>
       </w:pPr>
       <w:r>
         <w:rPr>
           <w:i/>
           <w:sz w:val="18"/>
         </w:rPr>
-        <w:t>Automotive Mechatronics Workshop, ATBU, Bauchi</w:t>
-      </w:r>
-    </w:p>
-    <w:p>
-      <w:pPr>
-        <w:spacing w:after="34" w:line="240" w:lineRule="auto"/>
+        <w:t>FIRS TaxPro-Max workflow | Confidential repository</w:t>
+      </w:r>
+    </w:p>
+    <w:p>
+      <w:pPr>
+        <w:spacing w:before="0" w:after="34" w:line="240" w:lineRule="auto"/>
         <w:ind w:left="202" w:hanging="144"/>
       </w:pPr>
       <w:r>
         <w:rPr>
           <w:sz w:val="18"/>
         </w:rPr>
-        <w:t>• Analysed engineering design and safety requirements for LPG conversion kits and converted small petrol engines to dual-fuel operation.</w:t>
-      </w:r>
-    </w:p>
-    <w:p>
-      <w:pPr>
-        <w:spacing w:after="34" w:line="240" w:lineRule="auto"/>
+        <w:t>• Built a Python-based scraper for extracting company tax data from the TaxPro-Max portal and distributed workloads across multiple Flask servers.</w:t>
+      </w:r>
+    </w:p>
+    <w:p>
+      <w:pPr>
+        <w:spacing w:before="0" w:after="34" w:line="240" w:lineRule="auto"/>
         <w:ind w:left="202" w:hanging="144"/>
       </w:pPr>
       <w:r>
         <w:rPr>
           <w:sz w:val="18"/>
         </w:rPr>
-        <w:t>• Evaluated fuel efficiency, emissions and operating-cost implications relative to petrol, with emphasis on cleaner and lower-cost mobility.</w:t>
-      </w:r>
-    </w:p>
-    <w:p>
-      <w:pPr>
-        <w:pStyle w:val="2"/>
-        <w:keepNext/>
-        <w:spacing w:before="120" w:after="50" w:line="240" w:lineRule="auto"/>
-      </w:pPr>
-      <w:r>
-        <w:rPr>
-          <w:rFonts w:ascii="Aptos" w:hAnsi="Aptos"/>
-          <w:b/>
-          <w:sz w:val="20"/>
-        </w:rPr>
-        <w:t>PROFESSIONAL, RESEARCH &amp; PRODUCT DEVELOPMENT EXPERIENCE</w:t>
+        <w:t>• Extracted and cleaned datasets with more than 7,000 rows and 50+ fields and generated structured Excel reports for tax analysis and compliance work.</w:t>
       </w:r>
     </w:p>
     <w:tbl>
@@ -641,22 +1104,22 @@
               <w:top w:w="20" w:type="dxa"/>
               <w:left w:w="0" w:type="dxa"/>
               <w:bottom w:w="20" w:type="dxa"/>
-              <w:right w:w="40" w:type="dxa"/>
+              <w:right w:w="0" w:type="dxa"/>
+              <w:start w:w="0" w:type="dxa"/>
+              <w:end w:w="40" w:type="dxa"/>
             </w:tcMar>
             <w:vAlign w:val="center"/>
           </w:tcPr>
           <w:p>
             <w:pPr>
-              <w:keepNext/>
-              <w:spacing w:before="0" w:after="0" w:line="240" w:lineRule="auto"/>
+              <w:spacing w:before="80" w:after="0"/>
             </w:pPr>
             <w:r>
               <w:rPr>
-                <w:rFonts w:ascii="Aptos" w:hAnsi="Aptos"/>
                 <w:b/>
-                <w:sz w:val="18"/>
+                <w:sz w:val="20"/>
               </w:rPr>
-              <w:t>Founder – Sahab Technology Integrated Limited</w:t>
+              <w:t>Industrial Training – Industrial Infrastructure Development, NADDC</w:t>
             </w:r>
           </w:p>
         </w:tc>
@@ -665,25 +1128,24 @@
             <w:tcW w:w="1512" w:type="dxa"/>
             <w:tcMar>
               <w:top w:w="20" w:type="dxa"/>
-              <w:left w:w="20" w:type="dxa"/>
+              <w:left w:w="0" w:type="dxa"/>
               <w:bottom w:w="20" w:type="dxa"/>
               <w:right w:w="0" w:type="dxa"/>
+              <w:start w:w="20" w:type="dxa"/>
+              <w:end w:w="0" w:type="dxa"/>
             </w:tcMar>
             <w:vAlign w:val="center"/>
           </w:tcPr>
           <w:p>
             <w:pPr>
-              <w:keepNext/>
-              <w:spacing w:before="0" w:after="0" w:line="240" w:lineRule="auto"/>
-              <w:jc w:val="right"/>
+              <w:spacing w:before="80" w:after="0"/>
             </w:pPr>
             <w:r>
               <w:rPr>
-                <w:rFonts w:ascii="Aptos" w:hAnsi="Aptos"/>
                 <w:b/>
-                <w:sz w:val="18"/>
+                <w:sz w:val="20"/>
               </w:rPr>
-              <w:t>2025–Present</w:t>
+              <w:t>2021</w:t>
             </w:r>
           </w:p>
         </w:tc>
@@ -691,146 +1153,37 @@
     </w:tbl>
     <w:p>
       <w:pPr>
-        <w:keepNext/>
-        <w:spacing w:before="0" w:after="24" w:line="240" w:lineRule="auto"/>
-      </w:pPr>
-      <w:r>
-        <w:rPr>
-          <w:b w:val="0"/>
-          <w:i/>
-          <w:sz w:val="18"/>
-        </w:rPr>
-        <w:t>Technology entrepreneurship, software automation and digital systems</w:t>
-      </w:r>
-      <w:r>
-        <w:rPr>
-          <w:b w:val="0"/>
-          <w:i w:val="0"/>
-          <w:sz w:val="18"/>
-        </w:rPr>
-        <w:t xml:space="preserve">  |  </w:t>
-      </w:r>
-      <w:r>
-        <w:rPr>
-          <w:sz w:val="18"/>
-        </w:rPr>
-        <w:fldChar w:fldCharType="begin"/>
-      </w:r>
-      <w:r>
-        <w:rPr>
-          <w:sz w:val="18"/>
-        </w:rPr>
-        <w:instrText xml:space="preserve"> HYPERLINK "https://home.sahabs.tech/" \h </w:instrText>
-      </w:r>
-      <w:r>
-        <w:rPr>
-          <w:sz w:val="18"/>
-        </w:rPr>
-        <w:fldChar w:fldCharType="separate"/>
-      </w:r>
-      <w:r>
-        <w:rPr>
-          <w:color w:val="0563C1"/>
-          <w:sz w:val="18"/>
-          <w:u w:val="single"/>
-        </w:rPr>
-        <w:t>Company Website</w:t>
-      </w:r>
-      <w:r>
-        <w:rPr>
-          <w:color w:val="0563C1"/>
-          <w:sz w:val="18"/>
-          <w:u w:val="single"/>
-        </w:rPr>
-        <w:fldChar w:fldCharType="end"/>
-      </w:r>
-    </w:p>
-    <w:p>
-      <w:pPr>
-        <w:spacing w:before="0" w:after="24" w:line="240" w:lineRule="auto"/>
-        <w:ind w:left="202" w:hanging="144"/>
-      </w:pPr>
-      <w:r>
-        <w:rPr>
-          <w:b/>
-          <w:i w:val="0"/>
-          <w:sz w:val="18"/>
-        </w:rPr>
-        <w:t>• Product: NYSC Clearance</w:t>
-      </w:r>
-      <w:r>
-        <w:rPr>
-          <w:b w:val="0"/>
-          <w:i w:val="0"/>
-          <w:sz w:val="18"/>
-        </w:rPr>
-        <w:t xml:space="preserve">  |  </w:t>
-      </w:r>
-      <w:r>
-        <w:rPr>
-          <w:sz w:val="18"/>
-        </w:rPr>
-        <w:fldChar w:fldCharType="begin"/>
-      </w:r>
-      <w:r>
-        <w:rPr>
-          <w:sz w:val="18"/>
-        </w:rPr>
-        <w:instrText xml:space="preserve"> HYPERLINK "https://nyscclearance.com/" \h </w:instrText>
-      </w:r>
-      <w:r>
-        <w:rPr>
-          <w:sz w:val="18"/>
-        </w:rPr>
-        <w:fldChar w:fldCharType="separate"/>
-      </w:r>
-      <w:r>
-        <w:rPr>
-          <w:color w:val="0563C1"/>
-          <w:sz w:val="18"/>
-          <w:u w:val="single"/>
-        </w:rPr>
-        <w:t>Live Platform</w:t>
-      </w:r>
-      <w:r>
-        <w:rPr>
-          <w:color w:val="0563C1"/>
-          <w:sz w:val="18"/>
-          <w:u w:val="single"/>
-        </w:rPr>
-        <w:fldChar w:fldCharType="end"/>
-      </w:r>
-      <w:r>
-        <w:rPr>
-          <w:b w:val="0"/>
-          <w:i w:val="0"/>
-          <w:sz w:val="18"/>
-        </w:rPr>
-        <w:t>, a SaaS platform for corps-member onboarding, attendance, leave, queries and monthly performance clearance.</w:t>
-      </w:r>
-    </w:p>
-    <w:p>
-      <w:pPr>
-        <w:spacing w:before="0" w:after="34" w:line="240" w:lineRule="auto"/>
-        <w:ind w:left="202" w:hanging="144"/>
-      </w:pPr>
-      <w:r>
-        <w:rPr>
-          <w:sz w:val="18"/>
-        </w:rPr>
-        <w:t>• Implemented face recognition, geofenced clock-in, QR-verified clearance letters, reporting, subscription/wallet features and organisation-specific deployment.</w:t>
-      </w:r>
-    </w:p>
-    <w:p>
-      <w:pPr>
-        <w:spacing w:before="0" w:after="34" w:line="240" w:lineRule="auto"/>
-        <w:ind w:left="202" w:hanging="144"/>
-      </w:pPr>
-      <w:r>
-        <w:rPr>
-          <w:sz w:val="18"/>
-        </w:rPr>
-        <w:t>• Built the platform with Django REST Framework, React/Vite, PostgreSQL, Paystack, Google Maps and Linux/Nginx deployment.</w:t>
+        <w:spacing w:before="0" w:after="30" w:line="240" w:lineRule="auto"/>
+      </w:pPr>
+      <w:r>
+        <w:rPr>
+          <w:sz w:val="19"/>
+        </w:rPr>
+        <w:t xml:space="preserve">National Automotive Design and Development Council (NADDC), Abuja | 6-month industrial training</w:t>
+      </w:r>
+    </w:p>
+    <w:p>
+      <w:pPr>
+        <w:spacing w:before="0" w:after="20" w:line="240" w:lineRule="auto"/>
+        <w:ind w:left="180" w:hanging="120"/>
+      </w:pPr>
+      <w:r>
+        <w:rPr>
+          <w:sz w:val="19"/>
+        </w:rPr>
+        <w:t xml:space="preserve">• Worked within the Industrial Infrastructure Development department and gained practical exposure to institutional activities supporting Nigeria’s automotive industry.</w:t>
+      </w:r>
+    </w:p>
+    <w:p>
+      <w:pPr>
+        <w:spacing w:before="0" w:after="20" w:line="240" w:lineRule="auto"/>
+        <w:ind w:left="180" w:hanging="120"/>
+      </w:pPr>
+      <w:r>
+        <w:rPr>
+          <w:sz w:val="19"/>
+        </w:rPr>
+        <w:t xml:space="preserve">• Supported routine departmental tasks and developed a broader understanding of automotive-sector infrastructure, industrial development and public-sector operations.</w:t>
       </w:r>
     </w:p>
     <w:tbl>
@@ -869,22 +1222,22 @@
               <w:top w:w="20" w:type="dxa"/>
               <w:left w:w="0" w:type="dxa"/>
               <w:bottom w:w="20" w:type="dxa"/>
-              <w:right w:w="40" w:type="dxa"/>
+              <w:right w:w="0" w:type="dxa"/>
+              <w:start w:w="0" w:type="dxa"/>
+              <w:end w:w="40" w:type="dxa"/>
             </w:tcMar>
             <w:vAlign w:val="center"/>
           </w:tcPr>
           <w:p>
             <w:pPr>
-              <w:keepNext/>
-              <w:spacing w:before="0" w:after="0" w:line="240" w:lineRule="auto"/>
+              <w:spacing w:before="80" w:after="0"/>
             </w:pPr>
             <w:r>
               <w:rPr>
-                <w:rFonts w:ascii="Aptos" w:hAnsi="Aptos"/>
                 <w:b/>
-                <w:sz w:val="18"/>
+                <w:sz w:val="20"/>
               </w:rPr>
-              <w:t>National Youth Service Corps (NYSC) – Information Technology Department, NDIC</w:t>
+              <w:t>Teaching Practice – GDSS Shongo Idrisa, Gombe</w:t>
             </w:r>
           </w:p>
         </w:tc>
@@ -893,33 +1246,24 @@
             <w:tcW w:w="1512" w:type="dxa"/>
             <w:tcMar>
               <w:top w:w="20" w:type="dxa"/>
-              <w:left w:w="20" w:type="dxa"/>
+              <w:left w:w="0" w:type="dxa"/>
               <w:bottom w:w="20" w:type="dxa"/>
               <w:right w:w="0" w:type="dxa"/>
+              <w:start w:w="20" w:type="dxa"/>
+              <w:end w:w="0" w:type="dxa"/>
             </w:tcMar>
             <w:vAlign w:val="center"/>
           </w:tcPr>
           <w:p>
             <w:pPr>
-              <w:keepNext/>
-              <w:spacing w:before="0" w:after="0" w:line="240" w:lineRule="auto"/>
-              <w:jc w:val="right"/>
-              <w:rPr>
-                <w:rFonts w:hint="default"/>
-                <w:b/>
-                <w:bCs/>
-                <w:lang w:val="en-US"/>
-              </w:rPr>
+              <w:spacing w:before="80" w:after="0"/>
             </w:pPr>
             <w:r>
               <w:rPr>
-                <w:rFonts w:hint="default" w:ascii="Aptos" w:hAnsi="Aptos"/>
                 <w:b/>
-                <w:bCs/>
-                <w:sz w:val="18"/>
-                <w:lang w:val="en-US"/>
+                <w:sz w:val="20"/>
               </w:rPr>
-              <w:t>2023–2024</w:t>
+              <w:t>2021</w:t>
             </w:r>
           </w:p>
         </w:tc>
@@ -927,94 +1271,37 @@
     </w:tbl>
     <w:p>
       <w:pPr>
-        <w:keepNext/>
-        <w:spacing w:before="0" w:after="24" w:line="240" w:lineRule="auto"/>
-      </w:pPr>
-      <w:r>
-        <w:rPr>
-          <w:b w:val="0"/>
-          <w:i/>
-          <w:sz w:val="18"/>
-        </w:rPr>
-        <w:t>Nigeria Deposit Insurance Corporation (NDIC)</w:t>
-      </w:r>
-      <w:r>
-        <w:rPr>
-          <w:b w:val="0"/>
-          <w:i w:val="0"/>
-          <w:sz w:val="18"/>
-        </w:rPr>
-        <w:t xml:space="preserve">  |  </w:t>
-      </w:r>
-      <w:r>
-        <w:rPr>
-          <w:sz w:val="18"/>
-        </w:rPr>
-        <w:fldChar w:fldCharType="begin"/>
-      </w:r>
-      <w:r>
-        <w:rPr>
-          <w:sz w:val="18"/>
-        </w:rPr>
-        <w:instrText xml:space="preserve"> HYPERLINK "https://youtu.be/jJ7R_1tRwM8" \h </w:instrText>
-      </w:r>
-      <w:r>
-        <w:rPr>
-          <w:sz w:val="18"/>
-        </w:rPr>
-        <w:fldChar w:fldCharType="separate"/>
-      </w:r>
-      <w:r>
-        <w:rPr>
-          <w:color w:val="0563C1"/>
-          <w:sz w:val="18"/>
-          <w:u w:val="single"/>
-        </w:rPr>
-        <w:t>Demo Video</w:t>
-      </w:r>
-      <w:r>
-        <w:rPr>
-          <w:color w:val="0563C1"/>
-          <w:sz w:val="18"/>
-          <w:u w:val="single"/>
-        </w:rPr>
-        <w:fldChar w:fldCharType="end"/>
-      </w:r>
-    </w:p>
-    <w:p>
-      <w:pPr>
-        <w:spacing w:before="0" w:after="34" w:line="240" w:lineRule="auto"/>
-        <w:ind w:left="202" w:hanging="144"/>
-      </w:pPr>
-      <w:r>
-        <w:rPr>
-          <w:sz w:val="18"/>
-        </w:rPr>
-        <w:t>• Served in the Information Technology Department, supporting day-to-day IT operations and contributing to digital process improvement during the NYSC service year.</w:t>
-      </w:r>
-    </w:p>
-    <w:p>
-      <w:pPr>
-        <w:spacing w:before="0" w:after="34" w:line="240" w:lineRule="auto"/>
-        <w:ind w:left="202" w:hanging="144"/>
-      </w:pPr>
-      <w:r>
-        <w:rPr>
-          <w:sz w:val="18"/>
-        </w:rPr>
-        <w:t>• Developed a face-recognition attendance module using Python and web technologies for real-time biometric attendance logging.</w:t>
-      </w:r>
-    </w:p>
-    <w:p>
-      <w:pPr>
-        <w:spacing w:before="0" w:after="34" w:line="240" w:lineRule="auto"/>
-        <w:ind w:left="202" w:hanging="144"/>
-      </w:pPr>
-      <w:r>
-        <w:rPr>
-          <w:sz w:val="18"/>
-        </w:rPr>
-        <w:t>• Designed backend workflows for attendance analysis, leave/query processing and automated clearance-letter generation, improving efficiency, traceability and transparency for corps members and interns.</w:t>
+        <w:spacing w:before="0" w:after="30" w:line="240" w:lineRule="auto"/>
+      </w:pPr>
+      <w:r>
+        <w:rPr>
+          <w:sz w:val="19"/>
+        </w:rPr>
+        <w:t xml:space="preserve">Government Day Secondary School (GDSS) Shongo Idrisa, Gombe | 4-month teaching practice</w:t>
+      </w:r>
+    </w:p>
+    <w:p>
+      <w:pPr>
+        <w:spacing w:before="0" w:after="20" w:line="240" w:lineRule="auto"/>
+        <w:ind w:left="180" w:hanging="120"/>
+      </w:pPr>
+      <w:r>
+        <w:rPr>
+          <w:sz w:val="19"/>
+        </w:rPr>
+        <w:t xml:space="preserve">• Prepared lesson plans, delivered classroom instruction, assessed student learning and applied classroom-management techniques during supervised teaching practice.</w:t>
+      </w:r>
+    </w:p>
+    <w:p>
+      <w:pPr>
+        <w:spacing w:before="0" w:after="20" w:line="240" w:lineRule="auto"/>
+        <w:ind w:left="180" w:hanging="120"/>
+      </w:pPr>
+      <w:r>
+        <w:rPr>
+          <w:sz w:val="19"/>
+        </w:rPr>
+        <w:t xml:space="preserve">• Strengthened communication, mentoring and instructional skills through direct engagement with secondary-school students.</w:t>
       </w:r>
     </w:p>
     <w:tbl>
@@ -1053,22 +1340,22 @@
               <w:top w:w="20" w:type="dxa"/>
               <w:left w:w="0" w:type="dxa"/>
               <w:bottom w:w="20" w:type="dxa"/>
-              <w:right w:w="40" w:type="dxa"/>
+              <w:right w:w="0" w:type="dxa"/>
+              <w:start w:w="0" w:type="dxa"/>
+              <w:end w:w="40" w:type="dxa"/>
             </w:tcMar>
             <w:vAlign w:val="center"/>
           </w:tcPr>
           <w:p>
             <w:pPr>
-              <w:keepNext/>
-              <w:spacing w:before="0" w:after="0" w:line="240" w:lineRule="auto"/>
+              <w:spacing w:before="80" w:after="0"/>
             </w:pPr>
             <w:r>
               <w:rPr>
-                <w:rFonts w:ascii="Aptos" w:hAnsi="Aptos"/>
                 <w:b/>
-                <w:sz w:val="18"/>
+                <w:sz w:val="20"/>
               </w:rPr>
-              <w:t>Data Automation Project – Tax Data Scraper</w:t>
+              <w:t>Junior Technician Intern – Exotic Multi Synergy Autos Limited</w:t>
             </w:r>
           </w:p>
         </w:tc>
@@ -1077,31 +1364,24 @@
             <w:tcW w:w="1512" w:type="dxa"/>
             <w:tcMar>
               <w:top w:w="20" w:type="dxa"/>
-              <w:left w:w="20" w:type="dxa"/>
+              <w:left w:w="0" w:type="dxa"/>
               <w:bottom w:w="20" w:type="dxa"/>
               <w:right w:w="0" w:type="dxa"/>
+              <w:start w:w="20" w:type="dxa"/>
+              <w:end w:w="0" w:type="dxa"/>
             </w:tcMar>
             <w:vAlign w:val="center"/>
           </w:tcPr>
           <w:p>
             <w:pPr>
-              <w:keepNext/>
-              <w:spacing w:before="0" w:after="0" w:line="240" w:lineRule="auto"/>
-              <w:jc w:val="right"/>
-              <w:rPr>
-                <w:rFonts w:hint="default"/>
-                <w:lang w:val="en-US"/>
-              </w:rPr>
+              <w:spacing w:before="80" w:after="0"/>
             </w:pPr>
             <w:r>
               <w:rPr>
-                <w:rFonts w:hint="default" w:ascii="Aptos" w:hAnsi="Aptos"/>
                 <w:b/>
-                <w:bCs/>
-                <w:sz w:val="18"/>
-                <w:lang w:val="en-US"/>
+                <w:sz w:val="20"/>
               </w:rPr>
-              <w:t>2023</w:t>
+              <w:t>2020</w:t>
             </w:r>
           </w:p>
         </w:tc>
@@ -1109,39 +1389,37 @@
     </w:tbl>
     <w:p>
       <w:pPr>
-        <w:keepNext/>
-        <w:spacing w:before="0" w:after="24" w:line="240" w:lineRule="auto"/>
-      </w:pPr>
-      <w:r>
-        <w:rPr>
-          <w:i/>
-          <w:sz w:val="18"/>
-        </w:rPr>
-        <w:t>FIRS TaxPro-Max workflow | Confidential repository</w:t>
-      </w:r>
-    </w:p>
-    <w:p>
-      <w:pPr>
-        <w:spacing w:before="0" w:after="34" w:line="240" w:lineRule="auto"/>
-        <w:ind w:left="202" w:hanging="144"/>
-      </w:pPr>
-      <w:r>
-        <w:rPr>
-          <w:sz w:val="18"/>
-        </w:rPr>
-        <w:t>• Built a Python-based scraper for extracting company tax data from the TaxPro-Max portal and distributed workloads across multiple Flask servers.</w:t>
-      </w:r>
-    </w:p>
-    <w:p>
-      <w:pPr>
-        <w:spacing w:before="0" w:after="34" w:line="240" w:lineRule="auto"/>
-        <w:ind w:left="202" w:hanging="144"/>
-      </w:pPr>
-      <w:r>
-        <w:rPr>
-          <w:sz w:val="18"/>
-        </w:rPr>
-        <w:t>• Extracted and cleaned datasets with more than 7,000 rows and 50+ fields and generated structured Excel reports for tax analysis and compliance work.</w:t>
+        <w:spacing w:before="0" w:after="30" w:line="240" w:lineRule="auto"/>
+      </w:pPr>
+      <w:r>
+        <w:rPr>
+          <w:sz w:val="19"/>
+        </w:rPr>
+        <w:t xml:space="preserve">Automotive workshop internship | COVID-19 period</w:t>
+      </w:r>
+    </w:p>
+    <w:p>
+      <w:pPr>
+        <w:spacing w:before="0" w:after="20" w:line="240" w:lineRule="auto"/>
+        <w:ind w:left="180" w:hanging="120"/>
+      </w:pPr>
+      <w:r>
+        <w:rPr>
+          <w:sz w:val="19"/>
+        </w:rPr>
+        <w:t xml:space="preserve">• Assisted with vehicle inspection, routine servicing, fault diagnosis and workshop repair activities under the supervision of senior technicians.</w:t>
+      </w:r>
+    </w:p>
+    <w:p>
+      <w:pPr>
+        <w:spacing w:before="0" w:after="20" w:line="240" w:lineRule="auto"/>
+        <w:ind w:left="180" w:hanging="120"/>
+      </w:pPr>
+      <w:r>
+        <w:rPr>
+          <w:sz w:val="19"/>
+        </w:rPr>
+        <w:t xml:space="preserve">• Built practical experience in automotive diagnostics, workshop safety and the use of tools and equipment in a professional service environment.</w:t>
       </w:r>
     </w:p>
     <w:tbl>
@@ -1180,20 +1458,24 @@
               <w:top w:w="20" w:type="dxa"/>
               <w:left w:w="0" w:type="dxa"/>
               <w:bottom w:w="20" w:type="dxa"/>
-              <w:right w:w="40" w:type="dxa"/>
+              <w:right w:w="0" w:type="dxa"/>
+              <w:start w:w="0" w:type="dxa"/>
+              <w:end w:w="40" w:type="dxa"/>
             </w:tcMar>
             <w:vAlign w:val="center"/>
           </w:tcPr>
           <w:p>
             <w:pPr>
-              <w:spacing w:before="80" w:after="0"/>
+              <w:keepNext/>
+              <w:spacing w:after="0" w:before="0" w:line="240" w:lineRule="auto"/>
             </w:pPr>
             <w:r>
               <w:rPr>
+                <w:rFonts w:ascii="Aptos" w:hAnsi="Aptos"/>
                 <w:b/>
-                <w:sz w:val="20"/>
+                <w:sz w:val="18"/>
               </w:rPr>
-              <w:t>Industrial Training – Industrial Infrastructure Development, NADDC</w:t>
+              <w:t>Process Automation Project – VAT Filing Automation System</w:t>
             </w:r>
           </w:p>
         </w:tc>
@@ -1202,61 +1484,96 @@
             <w:tcW w:w="1512" w:type="dxa"/>
             <w:tcMar>
               <w:top w:w="20" w:type="dxa"/>
-              <w:left w:w="20" w:type="dxa"/>
+              <w:left w:w="0" w:type="dxa"/>
               <w:bottom w:w="20" w:type="dxa"/>
               <w:right w:w="0" w:type="dxa"/>
+              <w:start w:w="20" w:type="dxa"/>
+              <w:end w:w="0" w:type="dxa"/>
             </w:tcMar>
             <w:vAlign w:val="center"/>
           </w:tcPr>
           <w:p>
             <w:pPr>
-              <w:spacing w:before="80" w:after="0"/>
+              <w:keepNext/>
+              <w:spacing w:after="0" w:before="0" w:line="240" w:lineRule="auto"/>
               <w:jc w:val="right"/>
             </w:pPr>
-            <w:r>
-              <w:rPr>
-                <w:b/>
-                <w:sz w:val="20"/>
-              </w:rPr>
-              <w:t>2021</w:t>
-            </w:r>
           </w:p>
         </w:tc>
       </w:tr>
     </w:tbl>
     <w:p>
       <w:pPr>
-        <w:spacing w:before="0" w:after="30" w:line="240" w:lineRule="auto"/>
-      </w:pPr>
-      <w:r>
-        <w:rPr>
-          <w:sz w:val="19"/>
-        </w:rPr>
-        <w:t>National Automotive Design and Development Council (NADDC), Abuja | 6-month industrial training</w:t>
-      </w:r>
-    </w:p>
-    <w:p>
-      <w:pPr>
-        <w:spacing w:before="0" w:after="20" w:line="240" w:lineRule="auto"/>
-        <w:ind w:left="180" w:hanging="120"/>
-      </w:pPr>
-      <w:r>
-        <w:rPr>
-          <w:sz w:val="19"/>
-        </w:rPr>
-        <w:t>• Worked within the Industrial Infrastructure Development department and gained practical exposure to institutional activities supporting Nigeria’s automotive industry.</w:t>
-      </w:r>
-    </w:p>
-    <w:p>
-      <w:pPr>
-        <w:spacing w:before="0" w:after="20" w:line="240" w:lineRule="auto"/>
-        <w:ind w:left="180" w:hanging="120"/>
-      </w:pPr>
-      <w:r>
-        <w:rPr>
-          <w:sz w:val="19"/>
-        </w:rPr>
-        <w:t>• Supported routine departmental tasks and developed a broader understanding of automotive-sector infrastructure, industrial development and public-sector operations.</w:t>
+        <w:keepNext/>
+        <w:spacing w:before="0" w:after="24" w:line="240" w:lineRule="auto"/>
+      </w:pPr>
+      <w:r>
+        <w:rPr>
+          <w:b w:val="0"/>
+          <w:i/>
+          <w:sz w:val="18"/>
+        </w:rPr>
+        <w:t>FIRS TaxPro-Max workflow</w:t>
+      </w:r>
+      <w:r>
+        <w:rPr>
+          <w:b w:val="0"/>
+          <w:i w:val="0"/>
+          <w:sz w:val="18"/>
+        </w:rPr>
+      </w:r>
+      <w:r>
+        <w:rPr>
+          <w:sz w:val="18"/>
+        </w:rPr>
+      </w:r>
+      <w:r>
+        <w:rPr>
+          <w:sz w:val="18"/>
+        </w:rPr>
+      </w:r>
+      <w:r>
+        <w:rPr>
+          <w:sz w:val="18"/>
+        </w:rPr>
+      </w:r>
+      <w:r>
+        <w:rPr>
+          <w:color w:val="0563C1"/>
+          <w:sz w:val="18"/>
+          <w:u w:val="single"/>
+        </w:rPr>
+      </w:r>
+      <w:r>
+        <w:rPr>
+          <w:color w:val="0563C1"/>
+          <w:sz w:val="18"/>
+          <w:u w:val="single"/>
+        </w:rPr>
+      </w:r>
+    </w:p>
+    <w:p>
+      <w:pPr>
+        <w:spacing w:before="0" w:after="34" w:line="240" w:lineRule="auto"/>
+        <w:ind w:left="202" w:hanging="144"/>
+      </w:pPr>
+      <w:r>
+        <w:rPr>
+          <w:sz w:val="18"/>
+        </w:rPr>
+        <w:t>• Developed an automated workflow for VAT return submission, including data input, validation and filing steps.</w:t>
+      </w:r>
+    </w:p>
+    <w:p>
+      <w:pPr>
+        <w:spacing w:before="0" w:after="34" w:line="240" w:lineRule="auto"/>
+        <w:ind w:left="202" w:hanging="144"/>
+      </w:pPr>
+      <w:r>
+        <w:rPr>
+          <w:sz w:val="18"/>
+        </w:rPr>
+        <w:t>• Reduced repetitive manual processing and helped improve consistency and accuracy of tax-submission workflows.</w:t>
       </w:r>
     </w:p>
     <w:tbl>
@@ -1295,400 +1612,16 @@
               <w:top w:w="20" w:type="dxa"/>
               <w:left w:w="0" w:type="dxa"/>
               <w:bottom w:w="20" w:type="dxa"/>
-              <w:right w:w="40" w:type="dxa"/>
-            </w:tcMar>
-            <w:vAlign w:val="center"/>
-          </w:tcPr>
-          <w:p>
-            <w:pPr>
-              <w:spacing w:before="80" w:after="0"/>
-            </w:pPr>
-            <w:r>
-              <w:rPr>
-                <w:b/>
-                <w:sz w:val="20"/>
-              </w:rPr>
-              <w:t>Teaching Practice – GDSS Shongo Idrisa, Gombe</w:t>
-            </w:r>
-          </w:p>
-        </w:tc>
-        <w:tc>
-          <w:tcPr>
-            <w:tcW w:w="1512" w:type="dxa"/>
-            <w:tcMar>
-              <w:top w:w="20" w:type="dxa"/>
-              <w:left w:w="20" w:type="dxa"/>
-              <w:bottom w:w="20" w:type="dxa"/>
               <w:right w:w="0" w:type="dxa"/>
-            </w:tcMar>
-            <w:vAlign w:val="center"/>
-          </w:tcPr>
-          <w:p>
-            <w:pPr>
-              <w:spacing w:before="80" w:after="0"/>
-              <w:jc w:val="right"/>
-            </w:pPr>
-            <w:r>
-              <w:rPr>
-                <w:b/>
-                <w:sz w:val="20"/>
-              </w:rPr>
-              <w:t>2021</w:t>
-            </w:r>
-          </w:p>
-        </w:tc>
-      </w:tr>
-    </w:tbl>
-    <w:p>
-      <w:pPr>
-        <w:spacing w:before="0" w:after="30" w:line="240" w:lineRule="auto"/>
-      </w:pPr>
-      <w:r>
-        <w:rPr>
-          <w:sz w:val="19"/>
-        </w:rPr>
-        <w:t>Government Day Secondary School (GDSS) Shongo Idrisa, Gombe | 4-month teaching practice</w:t>
-      </w:r>
-    </w:p>
-    <w:p>
-      <w:pPr>
-        <w:spacing w:before="0" w:after="20" w:line="240" w:lineRule="auto"/>
-        <w:ind w:left="180" w:hanging="120"/>
-      </w:pPr>
-      <w:r>
-        <w:rPr>
-          <w:sz w:val="19"/>
-        </w:rPr>
-        <w:t>• Prepared lesson plans, delivered classroom instruction, assessed student learning and applied classroom-management techniques during supervised teaching practice.</w:t>
-      </w:r>
-    </w:p>
-    <w:p>
-      <w:pPr>
-        <w:spacing w:before="0" w:after="20" w:line="240" w:lineRule="auto"/>
-        <w:ind w:left="180" w:hanging="120"/>
-      </w:pPr>
-      <w:r>
-        <w:rPr>
-          <w:sz w:val="19"/>
-        </w:rPr>
-        <w:t>• Strengthened communication, mentoring and instructional skills through direct engagement with secondary-school students.</w:t>
-      </w:r>
-    </w:p>
-    <w:tbl>
-      <w:tblPr>
-        <w:tblStyle w:val="6"/>
-        <w:tblW w:w="0" w:type="auto"/>
-        <w:jc w:val="center"/>
-        <w:tblBorders>
-          <w:top w:val="none" w:color="auto" w:sz="0" w:space="0"/>
-          <w:left w:val="none" w:color="auto" w:sz="0" w:space="0"/>
-          <w:bottom w:val="none" w:color="auto" w:sz="0" w:space="0"/>
-          <w:right w:val="none" w:color="auto" w:sz="0" w:space="0"/>
-          <w:insideH w:val="none" w:color="auto" w:sz="0" w:space="0"/>
-          <w:insideV w:val="none" w:color="auto" w:sz="0" w:space="0"/>
-        </w:tblBorders>
-        <w:tblLayout w:type="fixed"/>
-        <w:tblCellMar>
-          <w:top w:w="0" w:type="dxa"/>
-          <w:left w:w="108" w:type="dxa"/>
-          <w:bottom w:w="0" w:type="dxa"/>
-          <w:right w:w="108" w:type="dxa"/>
-        </w:tblCellMar>
-      </w:tblPr>
-      <w:tblGrid>
-        <w:gridCol w:w="8568"/>
-        <w:gridCol w:w="1656"/>
-      </w:tblGrid>
-      <w:tr>
-        <w:trPr>
-          <w:jc w:val="center"/>
-        </w:trPr>
-        <w:tc>
-          <w:tcPr>
-            <w:tcW w:w="9000" w:type="dxa"/>
-            <w:tcMar>
-              <w:top w:w="20" w:type="dxa"/>
-              <w:left w:w="0" w:type="dxa"/>
-              <w:bottom w:w="20" w:type="dxa"/>
-              <w:right w:w="40" w:type="dxa"/>
-            </w:tcMar>
-            <w:vAlign w:val="center"/>
-          </w:tcPr>
-          <w:p>
-            <w:pPr>
-              <w:spacing w:before="80" w:after="0"/>
-            </w:pPr>
-            <w:r>
-              <w:rPr>
-                <w:b/>
-                <w:sz w:val="20"/>
-              </w:rPr>
-              <w:t>Junior Technician Intern – Exotic Multi Synergy Autos Limited</w:t>
-            </w:r>
-          </w:p>
-        </w:tc>
-        <w:tc>
-          <w:tcPr>
-            <w:tcW w:w="1512" w:type="dxa"/>
-            <w:tcMar>
-              <w:top w:w="20" w:type="dxa"/>
-              <w:left w:w="20" w:type="dxa"/>
-              <w:bottom w:w="20" w:type="dxa"/>
-              <w:right w:w="0" w:type="dxa"/>
-            </w:tcMar>
-            <w:vAlign w:val="center"/>
-          </w:tcPr>
-          <w:p>
-            <w:pPr>
-              <w:spacing w:before="80" w:after="0"/>
-              <w:jc w:val="right"/>
-            </w:pPr>
-            <w:r>
-              <w:rPr>
-                <w:b/>
-                <w:sz w:val="20"/>
-              </w:rPr>
-              <w:t>2020</w:t>
-            </w:r>
-          </w:p>
-        </w:tc>
-      </w:tr>
-    </w:tbl>
-    <w:p>
-      <w:pPr>
-        <w:spacing w:before="0" w:after="30" w:line="240" w:lineRule="auto"/>
-      </w:pPr>
-      <w:r>
-        <w:rPr>
-          <w:sz w:val="19"/>
-        </w:rPr>
-        <w:t>Automotive workshop internship | COVID-19 period</w:t>
-      </w:r>
-    </w:p>
-    <w:p>
-      <w:pPr>
-        <w:spacing w:before="0" w:after="20" w:line="240" w:lineRule="auto"/>
-        <w:ind w:left="180" w:hanging="120"/>
-      </w:pPr>
-      <w:r>
-        <w:rPr>
-          <w:sz w:val="19"/>
-        </w:rPr>
-        <w:t>• Assisted with vehicle inspection, routine servicing, fault diagnosis and workshop repair activities under the supervision of senior technicians.</w:t>
-      </w:r>
-    </w:p>
-    <w:p>
-      <w:pPr>
-        <w:spacing w:before="0" w:after="20" w:line="240" w:lineRule="auto"/>
-        <w:ind w:left="180" w:hanging="120"/>
-      </w:pPr>
-      <w:r>
-        <w:rPr>
-          <w:sz w:val="19"/>
-        </w:rPr>
-        <w:t>• Built practical experience in automotive diagnostics, workshop safety and the use of tools and equipment in a professional service environment.</w:t>
-      </w:r>
-    </w:p>
-    <w:tbl>
-      <w:tblPr>
-        <w:tblStyle w:val="6"/>
-        <w:tblW w:w="0" w:type="auto"/>
-        <w:jc w:val="center"/>
-        <w:tblBorders>
-          <w:top w:val="none" w:color="auto" w:sz="0" w:space="0"/>
-          <w:left w:val="none" w:color="auto" w:sz="0" w:space="0"/>
-          <w:bottom w:val="none" w:color="auto" w:sz="0" w:space="0"/>
-          <w:right w:val="none" w:color="auto" w:sz="0" w:space="0"/>
-          <w:insideH w:val="none" w:color="auto" w:sz="0" w:space="0"/>
-          <w:insideV w:val="none" w:color="auto" w:sz="0" w:space="0"/>
-        </w:tblBorders>
-        <w:tblLayout w:type="fixed"/>
-        <w:tblCellMar>
-          <w:top w:w="0" w:type="dxa"/>
-          <w:left w:w="108" w:type="dxa"/>
-          <w:bottom w:w="0" w:type="dxa"/>
-          <w:right w:w="108" w:type="dxa"/>
-        </w:tblCellMar>
-      </w:tblPr>
-      <w:tblGrid>
-        <w:gridCol w:w="8568"/>
-        <w:gridCol w:w="1656"/>
-      </w:tblGrid>
-      <w:tr>
-        <w:trPr>
-          <w:jc w:val="center"/>
-        </w:trPr>
-        <w:tc>
-          <w:tcPr>
-            <w:tcW w:w="9000" w:type="dxa"/>
-            <w:tcMar>
-              <w:top w:w="20" w:type="dxa"/>
-              <w:left w:w="0" w:type="dxa"/>
-              <w:bottom w:w="20" w:type="dxa"/>
-              <w:right w:w="40" w:type="dxa"/>
+              <w:start w:w="0" w:type="dxa"/>
+              <w:end w:w="40" w:type="dxa"/>
             </w:tcMar>
             <w:vAlign w:val="center"/>
           </w:tcPr>
           <w:p>
             <w:pPr>
               <w:keepNext/>
-              <w:spacing w:before="0" w:after="0" w:line="240" w:lineRule="auto"/>
-            </w:pPr>
-            <w:r>
-              <w:rPr>
-                <w:rFonts w:ascii="Aptos" w:hAnsi="Aptos"/>
-                <w:b/>
-                <w:sz w:val="18"/>
-              </w:rPr>
-              <w:t>Process Automation Project – VAT Filing Automation System</w:t>
-            </w:r>
-          </w:p>
-        </w:tc>
-        <w:tc>
-          <w:tcPr>
-            <w:tcW w:w="1512" w:type="dxa"/>
-            <w:tcMar>
-              <w:top w:w="20" w:type="dxa"/>
-              <w:left w:w="20" w:type="dxa"/>
-              <w:bottom w:w="20" w:type="dxa"/>
-              <w:right w:w="0" w:type="dxa"/>
-            </w:tcMar>
-            <w:vAlign w:val="center"/>
-          </w:tcPr>
-          <w:p>
-            <w:pPr>
-              <w:keepNext/>
-              <w:spacing w:before="0" w:after="0" w:line="240" w:lineRule="auto"/>
-              <w:jc w:val="right"/>
-            </w:pPr>
-          </w:p>
-        </w:tc>
-      </w:tr>
-    </w:tbl>
-    <w:p>
-      <w:pPr>
-        <w:keepNext/>
-        <w:spacing w:before="0" w:after="24" w:line="240" w:lineRule="auto"/>
-      </w:pPr>
-      <w:r>
-        <w:rPr>
-          <w:b w:val="0"/>
-          <w:i/>
-          <w:sz w:val="18"/>
-        </w:rPr>
-        <w:t>FIRS TaxPro-Max workflow</w:t>
-      </w:r>
-      <w:r>
-        <w:rPr>
-          <w:b w:val="0"/>
-          <w:i w:val="0"/>
-          <w:sz w:val="18"/>
-        </w:rPr>
-        <w:t xml:space="preserve">  |  </w:t>
-      </w:r>
-      <w:r>
-        <w:rPr>
-          <w:sz w:val="18"/>
-        </w:rPr>
-        <w:fldChar w:fldCharType="begin"/>
-      </w:r>
-      <w:r>
-        <w:rPr>
-          <w:sz w:val="18"/>
-        </w:rPr>
-        <w:instrText xml:space="preserve"> HYPERLINK "https://github.com/Hhkwairanga/VATFiling" \h </w:instrText>
-      </w:r>
-      <w:r>
-        <w:rPr>
-          <w:sz w:val="18"/>
-        </w:rPr>
-        <w:fldChar w:fldCharType="separate"/>
-      </w:r>
-      <w:r>
-        <w:rPr>
-          <w:color w:val="0563C1"/>
-          <w:sz w:val="18"/>
-          <w:u w:val="single"/>
-        </w:rPr>
-        <w:t>Source Code</w:t>
-      </w:r>
-      <w:r>
-        <w:rPr>
-          <w:color w:val="0563C1"/>
-          <w:sz w:val="18"/>
-          <w:u w:val="single"/>
-        </w:rPr>
-        <w:fldChar w:fldCharType="end"/>
-      </w:r>
-    </w:p>
-    <w:p>
-      <w:pPr>
-        <w:spacing w:before="0" w:after="34" w:line="240" w:lineRule="auto"/>
-        <w:ind w:left="202" w:hanging="144"/>
-      </w:pPr>
-      <w:r>
-        <w:rPr>
-          <w:sz w:val="18"/>
-        </w:rPr>
-        <w:t>• Developed an automated workflow for VAT return submission, including data input, validation and filing steps.</w:t>
-      </w:r>
-    </w:p>
-    <w:p>
-      <w:pPr>
-        <w:spacing w:before="0" w:after="34" w:line="240" w:lineRule="auto"/>
-        <w:ind w:left="202" w:hanging="144"/>
-      </w:pPr>
-      <w:r>
-        <w:rPr>
-          <w:sz w:val="18"/>
-        </w:rPr>
-        <w:t>• Reduced repetitive manual processing and helped improve consistency and accuracy of tax-submission workflows.</w:t>
-      </w:r>
-    </w:p>
-    <w:tbl>
-      <w:tblPr>
-        <w:tblStyle w:val="6"/>
-        <w:tblW w:w="0" w:type="auto"/>
-        <w:jc w:val="center"/>
-        <w:tblBorders>
-          <w:top w:val="none" w:color="auto" w:sz="0" w:space="0"/>
-          <w:left w:val="none" w:color="auto" w:sz="0" w:space="0"/>
-          <w:bottom w:val="none" w:color="auto" w:sz="0" w:space="0"/>
-          <w:right w:val="none" w:color="auto" w:sz="0" w:space="0"/>
-          <w:insideH w:val="none" w:color="auto" w:sz="0" w:space="0"/>
-          <w:insideV w:val="none" w:color="auto" w:sz="0" w:space="0"/>
-        </w:tblBorders>
-        <w:tblLayout w:type="fixed"/>
-        <w:tblCellMar>
-          <w:top w:w="0" w:type="dxa"/>
-          <w:left w:w="108" w:type="dxa"/>
-          <w:bottom w:w="0" w:type="dxa"/>
-          <w:right w:w="108" w:type="dxa"/>
-        </w:tblCellMar>
-      </w:tblPr>
-      <w:tblGrid>
-        <w:gridCol w:w="8568"/>
-        <w:gridCol w:w="1656"/>
-      </w:tblGrid>
-      <w:tr>
-        <w:trPr>
-          <w:jc w:val="center"/>
-        </w:trPr>
-        <w:tc>
-          <w:tcPr>
-            <w:tcW w:w="9000" w:type="dxa"/>
-            <w:tcMar>
-              <w:top w:w="20" w:type="dxa"/>
-              <w:left w:w="0" w:type="dxa"/>
-              <w:bottom w:w="20" w:type="dxa"/>
-              <w:right w:w="40" w:type="dxa"/>
-            </w:tcMar>
-            <w:vAlign w:val="center"/>
-          </w:tcPr>
-          <w:p>
-            <w:pPr>
-              <w:keepNext/>
-              <w:spacing w:before="0" w:after="0" w:line="240" w:lineRule="auto"/>
+              <w:spacing w:after="0" w:before="0" w:line="240" w:lineRule="auto"/>
             </w:pPr>
             <w:r>
               <w:rPr>
@@ -1705,16 +1638,18 @@
             <w:tcW w:w="1512" w:type="dxa"/>
             <w:tcMar>
               <w:top w:w="20" w:type="dxa"/>
-              <w:left w:w="20" w:type="dxa"/>
+              <w:left w:w="0" w:type="dxa"/>
               <w:bottom w:w="20" w:type="dxa"/>
               <w:right w:w="0" w:type="dxa"/>
+              <w:start w:w="20" w:type="dxa"/>
+              <w:end w:w="0" w:type="dxa"/>
             </w:tcMar>
             <w:vAlign w:val="center"/>
           </w:tcPr>
           <w:p>
             <w:pPr>
               <w:keepNext/>
-              <w:spacing w:before="0" w:after="0" w:line="240" w:lineRule="auto"/>
+              <w:spacing w:after="0" w:before="0" w:line="240" w:lineRule="auto"/>
               <w:jc w:val="right"/>
             </w:pPr>
           </w:p>
@@ -1740,25 +1675,21 @@
           <w:i w:val="0"/>
           <w:sz w:val="18"/>
         </w:rPr>
-        <w:t xml:space="preserve">  |  </w:t>
-      </w:r>
-      <w:r>
-        <w:rPr>
-          <w:sz w:val="18"/>
-        </w:rPr>
-        <w:fldChar w:fldCharType="begin"/>
-      </w:r>
-      <w:r>
-        <w:rPr>
-          <w:sz w:val="18"/>
-        </w:rPr>
-        <w:instrText xml:space="preserve"> HYPERLINK "https://air-quality-checker-06s1.onrender.com/" \h </w:instrText>
-      </w:r>
-      <w:r>
-        <w:rPr>
-          <w:sz w:val="18"/>
-        </w:rPr>
-        <w:fldChar w:fldCharType="separate"/>
+      </w:r>
+      <w:r>
+        <w:rPr>
+          <w:sz w:val="18"/>
+        </w:rPr>
+      </w:r>
+      <w:r>
+        <w:rPr>
+          <w:sz w:val="18"/>
+        </w:rPr>
+      </w:r>
+      <w:r>
+        <w:rPr>
+          <w:sz w:val="18"/>
+        </w:rPr>
       </w:r>
       <w:r>
         <w:rPr>
@@ -1766,7 +1697,6 @@
           <w:sz w:val="18"/>
           <w:u w:val="single"/>
         </w:rPr>
-        <w:t>Live Demo</w:t>
       </w:r>
       <w:r>
         <w:rPr>
@@ -1774,7 +1704,6 @@
           <w:sz w:val="18"/>
           <w:u w:val="single"/>
         </w:rPr>
-        <w:fldChar w:fldCharType="end"/>
       </w:r>
       <w:r>
         <w:rPr>
@@ -1782,25 +1711,21 @@
           <w:i w:val="0"/>
           <w:sz w:val="18"/>
         </w:rPr>
-        <w:t xml:space="preserve">  |  </w:t>
-      </w:r>
-      <w:r>
-        <w:rPr>
-          <w:sz w:val="18"/>
-        </w:rPr>
-        <w:fldChar w:fldCharType="begin"/>
-      </w:r>
-      <w:r>
-        <w:rPr>
-          <w:sz w:val="18"/>
-        </w:rPr>
-        <w:instrText xml:space="preserve"> HYPERLINK "https://github.com/Hhkwairanga/VATFiling" \h </w:instrText>
-      </w:r>
-      <w:r>
-        <w:rPr>
-          <w:sz w:val="18"/>
-        </w:rPr>
-        <w:fldChar w:fldCharType="separate"/>
+      </w:r>
+      <w:r>
+        <w:rPr>
+          <w:sz w:val="18"/>
+        </w:rPr>
+      </w:r>
+      <w:r>
+        <w:rPr>
+          <w:sz w:val="18"/>
+        </w:rPr>
+      </w:r>
+      <w:r>
+        <w:rPr>
+          <w:sz w:val="18"/>
+        </w:rPr>
       </w:r>
       <w:r>
         <w:rPr>
@@ -1808,7 +1733,6 @@
           <w:sz w:val="18"/>
           <w:u w:val="single"/>
         </w:rPr>
-        <w:t>Source Code</w:t>
       </w:r>
       <w:r>
         <w:rPr>
@@ -1816,7 +1740,6 @@
           <w:sz w:val="18"/>
           <w:u w:val="single"/>
         </w:rPr>
-        <w:fldChar w:fldCharType="end"/>
       </w:r>
     </w:p>
     <w:p>
@@ -1847,7 +1770,7 @@
       <w:pPr>
         <w:pStyle w:val="2"/>
         <w:keepNext/>
-        <w:spacing w:before="120" w:after="50" w:line="240" w:lineRule="auto"/>
+        <w:spacing w:line="240" w:lineRule="auto" w:before="120" w:after="50"/>
       </w:pPr>
       <w:r>
         <w:rPr>
@@ -1860,7 +1783,7 @@
     </w:p>
     <w:p>
       <w:pPr>
-        <w:spacing w:after="34" w:line="240" w:lineRule="auto"/>
+        <w:spacing w:line="240" w:lineRule="auto" w:after="34"/>
         <w:ind w:left="202" w:hanging="144"/>
       </w:pPr>
       <w:r>
@@ -1874,7 +1797,7 @@
       <w:pPr>
         <w:pStyle w:val="2"/>
         <w:keepNext/>
-        <w:spacing w:before="120" w:after="50" w:line="240" w:lineRule="auto"/>
+        <w:spacing w:line="240" w:lineRule="auto" w:before="120" w:after="50"/>
       </w:pPr>
       <w:r>
         <w:rPr>
@@ -1887,7 +1810,7 @@
     </w:p>
     <w:p>
       <w:pPr>
-        <w:spacing w:after="34" w:line="240" w:lineRule="auto"/>
+        <w:spacing w:line="240" w:lineRule="auto" w:after="34"/>
         <w:ind w:left="202" w:hanging="144"/>
       </w:pPr>
       <w:r>
@@ -1899,7 +1822,7 @@
     </w:p>
     <w:p>
       <w:pPr>
-        <w:spacing w:after="34" w:line="240" w:lineRule="auto"/>
+        <w:spacing w:line="240" w:lineRule="auto" w:after="34"/>
         <w:ind w:left="202" w:hanging="144"/>
       </w:pPr>
       <w:r>
@@ -1911,21 +1834,29 @@
     </w:p>
     <w:p>
       <w:pPr>
-        <w:spacing w:after="34" w:line="240" w:lineRule="auto"/>
+        <w:spacing w:line="240" w:lineRule="auto" w:after="34"/>
         <w:ind w:left="202" w:hanging="144"/>
       </w:pPr>
       <w:r>
         <w:rPr>
           <w:sz w:val="18"/>
         </w:rPr>
-        <w:t>• Gombe State Government Scholarship Award for academic performance and indigene status.</w:t>
+        <w:t>• Gombe State Government Scholarship Award for academic performa</w:t>
+      </w:r>
+      <w:bookmarkStart w:id="0" w:name="_GoBack"/>
+      <w:bookmarkEnd w:id="0"/>
+      <w:r>
+        <w:rPr>
+          <w:sz w:val="18"/>
+        </w:rPr>
+        <w:t>nce and indigene status.</w:t>
       </w:r>
     </w:p>
     <w:p>
       <w:pPr>
         <w:pStyle w:val="2"/>
         <w:keepNext/>
-        <w:spacing w:before="120" w:after="50" w:line="240" w:lineRule="auto"/>
+        <w:spacing w:line="240" w:lineRule="auto" w:before="120" w:after="50"/>
       </w:pPr>
       <w:r>
         <w:rPr>
@@ -1969,7 +1900,9 @@
               <w:top w:w="20" w:type="dxa"/>
               <w:left w:w="0" w:type="dxa"/>
               <w:bottom w:w="20" w:type="dxa"/>
-              <w:right w:w="40" w:type="dxa"/>
+              <w:right w:w="0" w:type="dxa"/>
+              <w:start w:w="0" w:type="dxa"/>
+              <w:end w:w="40" w:type="dxa"/>
             </w:tcMar>
             <w:vAlign w:val="center"/>
           </w:tcPr>
@@ -1993,9 +1926,11 @@
             <w:tcW w:w="1512" w:type="dxa"/>
             <w:tcMar>
               <w:top w:w="20" w:type="dxa"/>
-              <w:left w:w="20" w:type="dxa"/>
+              <w:left w:w="0" w:type="dxa"/>
               <w:bottom w:w="20" w:type="dxa"/>
               <w:right w:w="0" w:type="dxa"/>
+              <w:start w:w="20" w:type="dxa"/>
+              <w:end w:w="0" w:type="dxa"/>
             </w:tcMar>
             <w:vAlign w:val="center"/>
           </w:tcPr>
@@ -2004,16 +1939,10 @@
               <w:keepNext/>
               <w:spacing w:before="0" w:after="0" w:line="240" w:lineRule="auto"/>
               <w:jc w:val="right"/>
-              <w:rPr>
-                <w:b/>
-                <w:bCs/>
-              </w:rPr>
             </w:pPr>
             <w:r>
               <w:rPr>
                 <w:rFonts w:ascii="Aptos" w:hAnsi="Aptos"/>
-                <w:b/>
-                <w:bCs/>
                 <w:sz w:val="18"/>
               </w:rPr>
               <w:t>2022 onward</w:t>
@@ -2029,7 +1958,9 @@
               <w:top w:w="20" w:type="dxa"/>
               <w:left w:w="0" w:type="dxa"/>
               <w:bottom w:w="20" w:type="dxa"/>
-              <w:right w:w="40" w:type="dxa"/>
+              <w:right w:w="0" w:type="dxa"/>
+              <w:start w:w="0" w:type="dxa"/>
+              <w:end w:w="40" w:type="dxa"/>
             </w:tcMar>
             <w:vAlign w:val="center"/>
           </w:tcPr>
@@ -2052,9 +1983,11 @@
             <w:tcW w:w="1512" w:type="dxa"/>
             <w:tcMar>
               <w:top w:w="20" w:type="dxa"/>
-              <w:left w:w="20" w:type="dxa"/>
+              <w:left w:w="0" w:type="dxa"/>
               <w:bottom w:w="20" w:type="dxa"/>
               <w:right w:w="0" w:type="dxa"/>
+              <w:start w:w="20" w:type="dxa"/>
+              <w:end w:w="0" w:type="dxa"/>
             </w:tcMar>
             <w:vAlign w:val="center"/>
           </w:tcPr>
@@ -2062,16 +1995,10 @@
             <w:pPr>
               <w:spacing w:before="0" w:after="0" w:line="240" w:lineRule="auto"/>
               <w:jc w:val="right"/>
-              <w:rPr>
-                <w:b/>
-                <w:bCs/>
-              </w:rPr>
             </w:pPr>
             <w:r>
               <w:rPr>
                 <w:rFonts w:ascii="Aptos" w:hAnsi="Aptos"/>
-                <w:b/>
-                <w:bCs/>
                 <w:sz w:val="18"/>
               </w:rPr>
               <w:t>2024</w:t>
@@ -2087,7 +2014,9 @@
               <w:top w:w="20" w:type="dxa"/>
               <w:left w:w="0" w:type="dxa"/>
               <w:bottom w:w="20" w:type="dxa"/>
-              <w:right w:w="40" w:type="dxa"/>
+              <w:right w:w="0" w:type="dxa"/>
+              <w:start w:w="0" w:type="dxa"/>
+              <w:end w:w="40" w:type="dxa"/>
             </w:tcMar>
             <w:vAlign w:val="center"/>
           </w:tcPr>
@@ -2110,9 +2039,11 @@
             <w:tcW w:w="1512" w:type="dxa"/>
             <w:tcMar>
               <w:top w:w="20" w:type="dxa"/>
-              <w:left w:w="20" w:type="dxa"/>
+              <w:left w:w="0" w:type="dxa"/>
               <w:bottom w:w="20" w:type="dxa"/>
               <w:right w:w="0" w:type="dxa"/>
+              <w:start w:w="20" w:type="dxa"/>
+              <w:end w:w="0" w:type="dxa"/>
             </w:tcMar>
             <w:vAlign w:val="center"/>
           </w:tcPr>
@@ -2120,16 +2051,10 @@
             <w:pPr>
               <w:spacing w:before="0" w:after="0" w:line="240" w:lineRule="auto"/>
               <w:jc w:val="right"/>
-              <w:rPr>
-                <w:b/>
-                <w:bCs/>
-              </w:rPr>
             </w:pPr>
             <w:r>
               <w:rPr>
                 <w:rFonts w:ascii="Aptos" w:hAnsi="Aptos"/>
-                <w:b/>
-                <w:bCs/>
                 <w:sz w:val="18"/>
               </w:rPr>
               <w:t>2024</w:t>
@@ -2145,7 +2070,9 @@
               <w:top w:w="20" w:type="dxa"/>
               <w:left w:w="0" w:type="dxa"/>
               <w:bottom w:w="20" w:type="dxa"/>
-              <w:right w:w="40" w:type="dxa"/>
+              <w:right w:w="0" w:type="dxa"/>
+              <w:start w:w="0" w:type="dxa"/>
+              <w:end w:w="40" w:type="dxa"/>
             </w:tcMar>
             <w:vAlign w:val="center"/>
           </w:tcPr>
@@ -2168,9 +2095,11 @@
             <w:tcW w:w="1512" w:type="dxa"/>
             <w:tcMar>
               <w:top w:w="20" w:type="dxa"/>
-              <w:left w:w="20" w:type="dxa"/>
+              <w:left w:w="0" w:type="dxa"/>
               <w:bottom w:w="20" w:type="dxa"/>
               <w:right w:w="0" w:type="dxa"/>
+              <w:start w:w="20" w:type="dxa"/>
+              <w:end w:w="0" w:type="dxa"/>
             </w:tcMar>
             <w:vAlign w:val="center"/>
           </w:tcPr>
@@ -2178,16 +2107,10 @@
             <w:pPr>
               <w:spacing w:before="0" w:after="0" w:line="240" w:lineRule="auto"/>
               <w:jc w:val="right"/>
-              <w:rPr>
-                <w:b/>
-                <w:bCs/>
-              </w:rPr>
             </w:pPr>
             <w:r>
               <w:rPr>
                 <w:rFonts w:ascii="Aptos" w:hAnsi="Aptos"/>
-                <w:b/>
-                <w:bCs/>
                 <w:sz w:val="18"/>
               </w:rPr>
               <w:t>2025</w:t>
@@ -2203,7 +2126,9 @@
               <w:top w:w="20" w:type="dxa"/>
               <w:left w:w="0" w:type="dxa"/>
               <w:bottom w:w="20" w:type="dxa"/>
-              <w:right w:w="40" w:type="dxa"/>
+              <w:right w:w="0" w:type="dxa"/>
+              <w:start w:w="0" w:type="dxa"/>
+              <w:end w:w="40" w:type="dxa"/>
             </w:tcMar>
             <w:vAlign w:val="center"/>
           </w:tcPr>
@@ -2226,9 +2151,11 @@
             <w:tcW w:w="1512" w:type="dxa"/>
             <w:tcMar>
               <w:top w:w="20" w:type="dxa"/>
-              <w:left w:w="20" w:type="dxa"/>
+              <w:left w:w="0" w:type="dxa"/>
               <w:bottom w:w="20" w:type="dxa"/>
               <w:right w:w="0" w:type="dxa"/>
+              <w:start w:w="20" w:type="dxa"/>
+              <w:end w:w="0" w:type="dxa"/>
             </w:tcMar>
             <w:vAlign w:val="center"/>
           </w:tcPr>
@@ -2236,16 +2163,10 @@
             <w:pPr>
               <w:spacing w:before="0" w:after="0" w:line="240" w:lineRule="auto"/>
               <w:jc w:val="right"/>
-              <w:rPr>
-                <w:b/>
-                <w:bCs/>
-              </w:rPr>
             </w:pPr>
             <w:r>
               <w:rPr>
                 <w:rFonts w:ascii="Aptos" w:hAnsi="Aptos"/>
-                <w:b/>
-                <w:bCs/>
                 <w:sz w:val="18"/>
               </w:rPr>
               <w:t>2025</w:t>
@@ -2261,7 +2182,9 @@
               <w:top w:w="20" w:type="dxa"/>
               <w:left w:w="0" w:type="dxa"/>
               <w:bottom w:w="20" w:type="dxa"/>
-              <w:right w:w="40" w:type="dxa"/>
+              <w:right w:w="0" w:type="dxa"/>
+              <w:start w:w="0" w:type="dxa"/>
+              <w:end w:w="40" w:type="dxa"/>
             </w:tcMar>
             <w:vAlign w:val="center"/>
           </w:tcPr>
@@ -2284,9 +2207,11 @@
             <w:tcW w:w="1512" w:type="dxa"/>
             <w:tcMar>
               <w:top w:w="20" w:type="dxa"/>
-              <w:left w:w="20" w:type="dxa"/>
+              <w:left w:w="0" w:type="dxa"/>
               <w:bottom w:w="20" w:type="dxa"/>
               <w:right w:w="0" w:type="dxa"/>
+              <w:start w:w="20" w:type="dxa"/>
+              <w:end w:w="0" w:type="dxa"/>
             </w:tcMar>
             <w:vAlign w:val="center"/>
           </w:tcPr>
@@ -2294,16 +2219,10 @@
             <w:pPr>
               <w:spacing w:before="0" w:after="0" w:line="240" w:lineRule="auto"/>
               <w:jc w:val="right"/>
-              <w:rPr>
-                <w:b/>
-                <w:bCs/>
-              </w:rPr>
             </w:pPr>
             <w:r>
               <w:rPr>
                 <w:rFonts w:ascii="Aptos" w:hAnsi="Aptos"/>
-                <w:b/>
-                <w:bCs/>
                 <w:sz w:val="18"/>
               </w:rPr>
               <w:t>2025</w:t>
@@ -2316,7 +2235,7 @@
       <w:pPr>
         <w:pStyle w:val="2"/>
         <w:keepNext/>
-        <w:spacing w:before="120" w:after="50" w:line="240" w:lineRule="auto"/>
+        <w:spacing w:before="120" w:line="240" w:lineRule="auto" w:after="50"/>
       </w:pPr>
       <w:r>
         <w:rPr>
@@ -2585,7 +2504,7 @@
       <w:footerReference r:id="rId5" w:type="default"/>
       <w:footerReference r:id="rId6" w:type="even"/>
       <w:pgSz w:w="12240" w:h="15840"/>
-      <w:pgMar w:top="511" w:right="835" w:bottom="691" w:left="835" w:header="709" w:footer="709" w:gutter="0"/>
+      <w:pgMar w:top="691" w:right="835" w:bottom="691" w:left="835" w:header="709" w:footer="709" w:gutter="0"/>
       <w:cols w:space="708" w:num="1"/>
       <w:docGrid w:linePitch="360" w:charSpace="0"/>
     </w:sectPr>
@@ -2627,7 +2546,7 @@
       </w:rPr>
       <w:id w:val="832188437"/>
       <w:docPartObj>
-        <w:docPartGallery w:val="autotext"/>
+        <w:docPartGallery w:val="AutoText"/>
       </w:docPartObj>
     </w:sdtPr>
     <w:sdtEndPr>
@@ -2684,6 +2603,12 @@
       <w:ind w:right="360"/>
       <w:jc w:val="center"/>
     </w:pPr>
+    <w:r>
+      <w:rPr>
+        <w:sz w:val="16"/>
+      </w:rPr>
+      <w:t>HARUNA HAMIDU KWAIRANGA  |  Academic CV</w:t>
+    </w:r>
   </w:p>
 </w:ftr>
 </file>
@@ -2697,7 +2622,7 @@
       </w:rPr>
       <w:id w:val="-1"/>
       <w:docPartObj>
-        <w:docPartGallery w:val="autotext"/>
+        <w:docPartGallery w:val="AutoText"/>
       </w:docPartObj>
     </w:sdtPr>
     <w:sdtEndPr>

</xml_diff>